<commit_message>
Deploying to gh-pages from @ Morrison-Lab/rme@896179445f17805287f9bc543ad7262959efd457 🚀
</commit_message>
<xml_diff>
--- a/chapters/binary-outcome-associations-handout.docx
+++ b/chapters/binary-outcome-associations-handout.docx
@@ -1375,7 +1375,7 @@
         </w:numPr>
       </w:pPr>
       <w:r>
-        <w:t xml:space="preserve">Dobson and Barnett (2018)</w:t>
+        <w:t xml:space="preserve">Dobson and Barnett [1]</w:t>
       </w:r>
       <w:r>
         <w:t xml:space="preserve">, Chapter 7</w:t>
@@ -1390,7 +1390,7 @@
         </w:numPr>
       </w:pPr>
       <w:r>
-        <w:t xml:space="preserve">Vittinghoff et al. (2012)</w:t>
+        <w:t xml:space="preserve">Vittinghoff et al. [2]</w:t>
       </w:r>
       <w:r>
         <w:t xml:space="preserve">, Chapter 5</w:t>
@@ -1436,7 +1436,7 @@
         </w:numPr>
       </w:pPr>
       <w:r>
-        <w:t xml:space="preserve">Nahhas (2024)</w:t>
+        <w:t xml:space="preserve">Nahhas [3]</w:t>
       </w:r>
       <w:r>
         <w:t xml:space="preserve"> </w:t>
@@ -1654,7 +1654,7 @@
               <w:t xml:space="preserve"> </w:t>
             </w:r>
             <w:r>
-              <w:t xml:space="preserve">(Rocke 2021)</w:t>
+              <w:t xml:space="preserve">[4]</w:t>
             </w:r>
             <w:r>
               <w:t xml:space="preserve">.</w:t>
@@ -2043,7 +2043,7 @@
               <w:t xml:space="preserve"> </w:t>
             </w:r>
             <w:r>
-              <w:t xml:space="preserve">(Rothman et al. 2021, chap. 4)</w:t>
+              <w:t xml:space="preserve">[5, Ch. 4]</w:t>
             </w:r>
             <w:r>
               <w:t xml:space="preserve">:</w:t>
@@ -2149,7 +2149,7 @@
               <w:t xml:space="preserve"> </w:t>
             </w:r>
             <w:r>
-              <w:t xml:space="preserve">(Rothman et al. 2021, chap. 4)</w:t>
+              <w:t xml:space="preserve">[5, Ch. 4]</w:t>
             </w:r>
             <w:r>
               <w:t xml:space="preserve">.</w:t>
@@ -2834,7 +2834,7 @@
               <w:t xml:space="preserve"> </w:t>
             </w:r>
             <w:r>
-              <w:t xml:space="preserve">(Roach et al. 2015)</w:t>
+              <w:t xml:space="preserve">[6]</w:t>
             </w:r>
             <w:r>
               <w:t xml:space="preserve">.</w:t>
@@ -4789,7 +4789,7 @@
                     <w:t xml:space="preserve"> </w:t>
                   </w:r>
                   <w:r>
-                    <w:t xml:space="preserve">(Rothman et al. 2021, chap. 8)</w:t>
+                    <w:t xml:space="preserve">[5, Ch. 8]</w:t>
                   </w:r>
                   <w:r>
                     <w:t xml:space="preserve">.</w:t>
@@ -4935,7 +4935,7 @@
                     <w:t xml:space="preserve"> </w:t>
                   </w:r>
                   <w:r>
-                    <w:t xml:space="preserve">(Rothman et al. 2021, chap. 7)</w:t>
+                    <w:t xml:space="preserve">[5, Ch. 7]</w:t>
                   </w:r>
                   <w:r>
                     <w:t xml:space="preserve">.</w:t>
@@ -7797,7 +7797,7 @@
               <w:t xml:space="preserve"> </w:t>
             </w:r>
             <w:r>
-              <w:t xml:space="preserve">Vittinghoff et al. (2012, sec. 8.1.4)</w:t>
+              <w:t xml:space="preserve">Vittinghoff et al. [2, Sec. 8.1.4]</w:t>
             </w:r>
             <w:r>
               <w:t xml:space="preserve">, which uses similar phrasing.</w:t>
@@ -14734,7 +14734,7 @@
               <w:t xml:space="preserve"> </w:t>
             </w:r>
             <w:r>
-              <w:t xml:space="preserve">(Starmer, n.d.)</w:t>
+              <w:t xml:space="preserve">[7]</w:t>
             </w:r>
             <w:r>
               <w:t xml:space="preserve">.</w:t>
@@ -28385,7 +28385,7 @@
               <w:t xml:space="preserve"> </w:t>
             </w:r>
             <w:r>
-              <w:t xml:space="preserve">(Starmer, n.d.)</w:t>
+              <w:t xml:space="preserve">[7]</w:t>
             </w:r>
             <w:r>
               <w:t xml:space="preserve">.</w:t>
@@ -37153,7 +37153,7 @@
               <w:t xml:space="preserve"> </w:t>
             </w:r>
             <w:r>
-              <w:t xml:space="preserve">(Rosenman et al. 1975)</w:t>
+              <w:t xml:space="preserve">[8]</w:t>
             </w:r>
             <w:r>
               <w:t xml:space="preserve">,</w:t>
@@ -45833,7 +45833,7 @@
         <w:t xml:space="preserve"> </w:t>
       </w:r>
       <w:r>
-        <w:t xml:space="preserve">(Lee 1994)</w:t>
+        <w:t xml:space="preserve">[9]</w:t>
       </w:r>
       <w:r>
         <w:t xml:space="preserve">,</w:t>
@@ -45938,7 +45938,7 @@
         <w:t xml:space="preserve"> </w:t>
       </w:r>
       <w:r>
-        <w:t xml:space="preserve">(Lumley 2010)</w:t>
+        <w:t xml:space="preserve">[10]</w:t>
       </w:r>
       <w:r>
         <w:t xml:space="preserve">.</w:t>
@@ -55994,7 +55994,16 @@
         <w:pStyle w:val="Bibliography"/>
       </w:pPr>
       <w:r>
-        <w:t xml:space="preserve">Dobson, Annette J, and Adrian G Barnett. 2018.</w:t>
+        <w:t xml:space="preserve">[1]</w:t>
+      </w:r>
+      <w:r>
+        <w:t xml:space="preserve"> </w:t>
+      </w:r>
+      <w:r>
+        <w:t xml:space="preserve">	</w:t>
+      </w:r>
+      <w:r>
+        <w:t xml:space="preserve">A. J. Dobson and A. G. Barnett,</w:t>
       </w:r>
       <w:r>
         <w:t xml:space="preserve"> </w:t>
@@ -56004,10 +56013,10 @@
           <w:i/>
           <w:iCs/>
         </w:rPr>
-        <w:t xml:space="preserve">An Introduction to Generalized Linear Models</w:t>
-      </w:r>
-      <w:r>
-        <w:t xml:space="preserve">. 4th ed. CRC press.</w:t>
+        <w:t xml:space="preserve">An introduction to generalized linear models</w:t>
+      </w:r>
+      <w:r>
+        <w:t xml:space="preserve">, 4th ed. CRC press, 2018. Available:</w:t>
       </w:r>
       <w:r>
         <w:t xml:space="preserve"> </w:t>
@@ -56020,24 +56029,24 @@
           <w:t xml:space="preserve">https://doi.org/10.1201/9781315182780</w:t>
         </w:r>
       </w:hyperlink>
-      <w:r>
-        <w:t xml:space="preserve">.</w:t>
-      </w:r>
     </w:p>
     <w:bookmarkEnd w:id="218"/>
-    <w:bookmarkStart w:id="220" w:name="ref-LEEJAMES1994ORoR"/>
+    <w:bookmarkStart w:id="220" w:name="ref-vittinghoff2e"/>
     <w:p>
       <w:pPr>
         <w:pStyle w:val="Bibliography"/>
       </w:pPr>
       <w:r>
-        <w:t xml:space="preserve">Lee, James. 1994.</w:t>
+        <w:t xml:space="preserve">[2]</w:t>
       </w:r>
       <w:r>
         <w:t xml:space="preserve"> </w:t>
       </w:r>
       <w:r>
-        <w:t xml:space="preserve">“Odds Ratio or Relative Risk for Cross-Sectional Data?”</w:t>
+        <w:t xml:space="preserve">	</w:t>
+      </w:r>
+      <w:r>
+        <w:t xml:space="preserve">E. Vittinghoff, D. V. Glidden, S. C. Shiboski, and C. E. McCulloch,</w:t>
       </w:r>
       <w:r>
         <w:t xml:space="preserve"> </w:t>
@@ -56047,13 +56056,10 @@
           <w:i/>
           <w:iCs/>
         </w:rPr>
-        <w:t xml:space="preserve">International Journal of Epidemiology</w:t>
-      </w:r>
-      <w:r>
-        <w:t xml:space="preserve"> </w:t>
-      </w:r>
-      <w:r>
-        <w:t xml:space="preserve">(England) 23 (1): 201–3.</w:t>
+        <w:t xml:space="preserve">Regression methods in biostatistics: Linear, logistic, survival, and repeated measures models</w:t>
+      </w:r>
+      <w:r>
+        <w:t xml:space="preserve">, 2nd ed. Springer, 2012. Available:</w:t>
       </w:r>
       <w:r>
         <w:t xml:space="preserve"> </w:t>
@@ -56063,21 +56069,27 @@
           <w:rPr>
             <w:rStyle w:val="Hyperlink"/>
           </w:rPr>
-          <w:t xml:space="preserve">https://doi.org/10.1093/ije/23.1.201</w:t>
+          <w:t xml:space="preserve">https://doi.org/10.1007/978-1-4614-1353-0</w:t>
         </w:r>
       </w:hyperlink>
-      <w:r>
-        <w:t xml:space="preserve">.</w:t>
-      </w:r>
     </w:p>
     <w:bookmarkEnd w:id="220"/>
-    <w:bookmarkStart w:id="222" w:name="ref-lumleyComplexSurveys2010"/>
+    <w:bookmarkStart w:id="222" w:name="ref-NahhasIRMPHR"/>
     <w:p>
       <w:pPr>
         <w:pStyle w:val="Bibliography"/>
       </w:pPr>
       <w:r>
-        <w:t xml:space="preserve">Lumley, Thomas. 2010.</w:t>
+        <w:t xml:space="preserve">[3]</w:t>
+      </w:r>
+      <w:r>
+        <w:t xml:space="preserve"> </w:t>
+      </w:r>
+      <w:r>
+        <w:t xml:space="preserve">	</w:t>
+      </w:r>
+      <w:r>
+        <w:t xml:space="preserve">R. W. Nahhas,</w:t>
       </w:r>
       <w:r>
         <w:t xml:space="preserve"> </w:t>
@@ -56087,7 +56099,7 @@
           <w:i/>
           <w:iCs/>
         </w:rPr>
-        <w:t xml:space="preserve">Complex Surveys : A Guide to Analysis Using</w:t>
+        <w:t xml:space="preserve">Introduction to regression methods for public health using</w:t>
       </w:r>
       <w:r>
         <w:rPr>
@@ -56104,63 +56116,12 @@
         <w:t xml:space="preserve">R</w:t>
       </w:r>
       <w:r>
-        <w:t xml:space="preserve">. Wiley Series in Survey Methodology. John Wiley.</w:t>
+        <w:t xml:space="preserve">. CRC Press, 2024. Available:</w:t>
       </w:r>
       <w:r>
         <w:t xml:space="preserve"> </w:t>
       </w:r>
       <w:hyperlink r:id="rId221">
-        <w:r>
-          <w:rPr>
-            <w:rStyle w:val="Hyperlink"/>
-          </w:rPr>
-          <w:t xml:space="preserve">https://doi.org/10.1002/9780470580066</w:t>
-        </w:r>
-      </w:hyperlink>
-      <w:r>
-        <w:t xml:space="preserve">.</w:t>
-      </w:r>
-    </w:p>
-    <w:bookmarkEnd w:id="222"/>
-    <w:bookmarkStart w:id="224" w:name="ref-NahhasIRMPHR"/>
-    <w:p>
-      <w:pPr>
-        <w:pStyle w:val="Bibliography"/>
-      </w:pPr>
-      <w:r>
-        <w:t xml:space="preserve">Nahhas, Ramzi W. 2024.</w:t>
-      </w:r>
-      <w:r>
-        <w:t xml:space="preserve"> </w:t>
-      </w:r>
-      <w:r>
-        <w:rPr>
-          <w:i/>
-          <w:iCs/>
-        </w:rPr>
-        <w:t xml:space="preserve">Introduction to Regression Methods for Public Health Using</w:t>
-      </w:r>
-      <w:r>
-        <w:rPr>
-          <w:i/>
-          <w:iCs/>
-        </w:rPr>
-        <w:t xml:space="preserve"> </w:t>
-      </w:r>
-      <w:r>
-        <w:rPr>
-          <w:i/>
-          <w:iCs/>
-        </w:rPr>
-        <w:t xml:space="preserve">R</w:t>
-      </w:r>
-      <w:r>
-        <w:t xml:space="preserve">. CRC Press.</w:t>
-      </w:r>
-      <w:r>
-        <w:t xml:space="preserve"> </w:t>
-      </w:r>
-      <w:hyperlink r:id="rId223">
         <w:r>
           <w:rPr>
             <w:rStyle w:val="Hyperlink"/>
@@ -56168,8 +56129,100 @@
           <w:t xml:space="preserve">https://www.bookdown.org/rwnahhas/RMPH/</w:t>
         </w:r>
       </w:hyperlink>
-      <w:r>
-        <w:t xml:space="preserve">.</w:t>
+    </w:p>
+    <w:bookmarkEnd w:id="222"/>
+    <w:bookmarkStart w:id="223" w:name="ref-rocke2021epi204"/>
+    <w:p>
+      <w:pPr>
+        <w:pStyle w:val="Bibliography"/>
+      </w:pPr>
+      <w:r>
+        <w:t xml:space="preserve">[4]</w:t>
+      </w:r>
+      <w:r>
+        <w:t xml:space="preserve"> </w:t>
+      </w:r>
+      <w:r>
+        <w:t xml:space="preserve">	</w:t>
+      </w:r>
+      <w:r>
+        <w:t xml:space="preserve">D. M. Rocke,</w:t>
+      </w:r>
+      <w:r>
+        <w:t xml:space="preserve"> </w:t>
+      </w:r>
+      <w:r>
+        <w:t xml:space="preserve">“</w:t>
+      </w:r>
+      <w:r>
+        <w:t xml:space="preserve">Epi</w:t>
+      </w:r>
+      <w:r>
+        <w:t xml:space="preserve"> </w:t>
+      </w:r>
+      <w:r>
+        <w:t xml:space="preserve">204 lecture notes,</w:t>
+      </w:r>
+      <w:r>
+        <w:t xml:space="preserve"> </w:t>
+      </w:r>
+      <w:r>
+        <w:t xml:space="preserve">Spring</w:t>
+      </w:r>
+      <w:r>
+        <w:t xml:space="preserve"> </w:t>
+      </w:r>
+      <w:r>
+        <w:t xml:space="preserve">2021.”</w:t>
+      </w:r>
+      <w:r>
+        <w:t xml:space="preserve"> </w:t>
+      </w:r>
+      <w:r>
+        <w:t xml:space="preserve">University of California, Davis, 2021. Available:</w:t>
+      </w:r>
+      <w:r>
+        <w:t xml:space="preserve"> </w:t>
+      </w:r>
+      <w:hyperlink r:id="rId11">
+        <w:r>
+          <w:rPr>
+            <w:rStyle w:val="Hyperlink"/>
+          </w:rPr>
+          <w:t xml:space="preserve">https://dmrocke.ucdavis.edu/Class/EPI204-Spring-2021/EPI204-Spring-2021.html</w:t>
+        </w:r>
+      </w:hyperlink>
+    </w:p>
+    <w:bookmarkEnd w:id="223"/>
+    <w:bookmarkStart w:id="224" w:name="ref-me4"/>
+    <w:p>
+      <w:pPr>
+        <w:pStyle w:val="Bibliography"/>
+      </w:pPr>
+      <w:r>
+        <w:t xml:space="preserve">[5]</w:t>
+      </w:r>
+      <w:r>
+        <w:t xml:space="preserve"> </w:t>
+      </w:r>
+      <w:r>
+        <w:t xml:space="preserve">	</w:t>
+      </w:r>
+      <w:r>
+        <w:t xml:space="preserve">K. J. Rothman, T. L. Lash, T. J. VanderWeele, and S. Haneuse,</w:t>
+      </w:r>
+      <w:r>
+        <w:t xml:space="preserve"> </w:t>
+      </w:r>
+      <w:r>
+        <w:rPr>
+          <w:i/>
+          <w:iCs/>
+        </w:rPr>
+        <w:t xml:space="preserve">Modern epidemiology</w:t>
+      </w:r>
+      <w:r>
+        <w:t xml:space="preserve">, Fourth edition. Philadelphia: Wolters Kluwer, 2021.</w:t>
       </w:r>
     </w:p>
     <w:bookmarkEnd w:id="224"/>
@@ -56179,13 +56232,22 @@
         <w:pStyle w:val="Bibliography"/>
       </w:pPr>
       <w:r>
-        <w:t xml:space="preserve">Roach, Rachel E. J., Frans M. Helmerhorst, Willem M. Lijfering, Theo Stijnen, Ale Algra, and Olaf M. Dekkers. 2015.</w:t>
+        <w:t xml:space="preserve">[6]</w:t>
       </w:r>
       <w:r>
         <w:t xml:space="preserve"> </w:t>
       </w:r>
       <w:r>
-        <w:t xml:space="preserve">“Combined Oral Contraceptives: The Risk of Myocardial Infarction and Ischemic Stroke.”</w:t>
+        <w:t xml:space="preserve">	</w:t>
+      </w:r>
+      <w:r>
+        <w:t xml:space="preserve">R. E. J. Roach, F. M. Helmerhorst, W. M. Lijfering, T. Stijnen, A. Algra, and O. M. Dekkers,</w:t>
+      </w:r>
+      <w:r>
+        <w:t xml:space="preserve"> </w:t>
+      </w:r>
+      <w:r>
+        <w:t xml:space="preserve">“Combined oral contraceptives: The risk of myocardial infarction and ischemic stroke,”</w:t>
       </w:r>
       <w:r>
         <w:t xml:space="preserve"> </w:t>
@@ -56198,7 +56260,7 @@
         <w:t xml:space="preserve">Cochrane Database of Systematic Reviews</w:t>
       </w:r>
       <w:r>
-        <w:t xml:space="preserve">, no. 8: CD011054.</w:t>
+        <w:t xml:space="preserve">, no. 8, p. CD011054, 2015, Available:</w:t>
       </w:r>
       <w:r>
         <w:t xml:space="preserve"> </w:t>
@@ -56211,235 +56273,65 @@
           <w:t xml:space="preserve">https://doi.org/10.1002/14651858.CD011054.pub2</w:t>
         </w:r>
       </w:hyperlink>
-      <w:r>
-        <w:t xml:space="preserve">.</w:t>
-      </w:r>
     </w:p>
     <w:bookmarkEnd w:id="226"/>
-    <w:bookmarkStart w:id="227" w:name="ref-rocke2021epi204"/>
+    <w:bookmarkStart w:id="228" w:name="ref-starmer-statquest"/>
     <w:p>
       <w:pPr>
         <w:pStyle w:val="Bibliography"/>
       </w:pPr>
       <w:r>
-        <w:t xml:space="preserve">Rocke, David M. 2021.</w:t>
+        <w:t xml:space="preserve">[7]</w:t>
       </w:r>
       <w:r>
         <w:t xml:space="preserve"> </w:t>
       </w:r>
       <w:r>
-        <w:rPr>
-          <w:i/>
-          <w:iCs/>
-        </w:rPr>
-        <w:t xml:space="preserve">Epi</w:t>
-      </w:r>
-      <w:r>
-        <w:rPr>
-          <w:i/>
-          <w:iCs/>
-        </w:rPr>
+        <w:t xml:space="preserve">	</w:t>
+      </w:r>
+      <w:r>
+        <w:t xml:space="preserve">J. Starmer,</w:t>
+      </w:r>
+      <w:r>
         <w:t xml:space="preserve"> </w:t>
       </w:r>
       <w:r>
-        <w:rPr>
-          <w:i/>
-          <w:iCs/>
-        </w:rPr>
-        <w:t xml:space="preserve">204 Lecture Notes,</w:t>
-      </w:r>
-      <w:r>
-        <w:rPr>
-          <w:i/>
-          <w:iCs/>
-        </w:rPr>
+        <w:t xml:space="preserve">“</w:t>
+      </w:r>
+      <w:r>
+        <w:t xml:space="preserve">StatQuest</w:t>
+      </w:r>
+      <w:r>
         <w:t xml:space="preserve"> </w:t>
       </w:r>
       <w:r>
-        <w:rPr>
-          <w:i/>
-          <w:iCs/>
-        </w:rPr>
-        <w:t xml:space="preserve">Spring</w:t>
-      </w:r>
-      <w:r>
-        <w:rPr>
-          <w:i/>
-          <w:iCs/>
-        </w:rPr>
+        <w:t xml:space="preserve">with</w:t>
+      </w:r>
+      <w:r>
         <w:t xml:space="preserve"> </w:t>
       </w:r>
       <w:r>
-        <w:rPr>
-          <w:i/>
-          <w:iCs/>
-        </w:rPr>
-        <w:t xml:space="preserve">2021</w:t>
-      </w:r>
-      <w:r>
-        <w:t xml:space="preserve">. University of California, Davis.</w:t>
+        <w:t xml:space="preserve">Josh</w:t>
       </w:r>
       <w:r>
         <w:t xml:space="preserve"> </w:t>
       </w:r>
-      <w:hyperlink r:id="rId11">
-        <w:r>
-          <w:rPr>
-            <w:rStyle w:val="Hyperlink"/>
-          </w:rPr>
-          <w:t xml:space="preserve">https://dmrocke.ucdavis.edu/Class/EPI204-Spring-2021/EPI204-Spring-2021.html</w:t>
-        </w:r>
-      </w:hyperlink>
-      <w:r>
-        <w:t xml:space="preserve">.</w:t>
-      </w:r>
-    </w:p>
-    <w:bookmarkEnd w:id="227"/>
-    <w:bookmarkStart w:id="229" w:name="ref-rosenman1975coronary"/>
-    <w:p>
-      <w:pPr>
-        <w:pStyle w:val="Bibliography"/>
-      </w:pPr>
-      <w:r>
-        <w:t xml:space="preserve">Rosenman, Ray H, Richard J Brand, C David Jenkins, Meyer Friedman, Reuben Straus, and Moses Wurm. 1975.</w:t>
+      <w:r>
+        <w:t xml:space="preserve">Starmer</w:t>
+      </w:r>
+      <w:r>
+        <w:t xml:space="preserve">.”</w:t>
       </w:r>
       <w:r>
         <w:t xml:space="preserve"> </w:t>
       </w:r>
       <w:r>
-        <w:t xml:space="preserve">“Coronary Heart Disease in the</w:t>
+        <w:t xml:space="preserve">YouTube channel. Available:</w:t>
       </w:r>
       <w:r>
         <w:t xml:space="preserve"> </w:t>
       </w:r>
-      <w:r>
-        <w:t xml:space="preserve">Western Collaborative Group Study</w:t>
-      </w:r>
-      <w:r>
-        <w:t xml:space="preserve">: Final Follow-up Experience of 8 1/2 Years.”</w:t>
-      </w:r>
-      <w:r>
-        <w:t xml:space="preserve"> </w:t>
-      </w:r>
-      <w:r>
-        <w:rPr>
-          <w:i/>
-          <w:iCs/>
-        </w:rPr>
-        <w:t xml:space="preserve">JAMA</w:t>
-      </w:r>
-      <w:r>
-        <w:t xml:space="preserve"> </w:t>
-      </w:r>
-      <w:r>
-        <w:t xml:space="preserve">233 (8): 872–77.</w:t>
-      </w:r>
-      <w:r>
-        <w:t xml:space="preserve"> </w:t>
-      </w:r>
-      <w:hyperlink r:id="rId228">
-        <w:r>
-          <w:rPr>
-            <w:rStyle w:val="Hyperlink"/>
-          </w:rPr>
-          <w:t xml:space="preserve">https://doi.org/10.1001/jama.1975.03260080034016</w:t>
-        </w:r>
-      </w:hyperlink>
-      <w:r>
-        <w:t xml:space="preserve">.</w:t>
-      </w:r>
-    </w:p>
-    <w:bookmarkEnd w:id="229"/>
-    <w:bookmarkStart w:id="230" w:name="ref-me4"/>
-    <w:p>
-      <w:pPr>
-        <w:pStyle w:val="Bibliography"/>
-      </w:pPr>
-      <w:r>
-        <w:t xml:space="preserve">Rothman, Kenneth J., Timothy L. Lash, Tyler J. VanderWeele, and Sebastien Haneuse. 2021.</w:t>
-      </w:r>
-      <w:r>
-        <w:t xml:space="preserve"> </w:t>
-      </w:r>
-      <w:r>
-        <w:rPr>
-          <w:i/>
-          <w:iCs/>
-        </w:rPr>
-        <w:t xml:space="preserve">Modern Epidemiology</w:t>
-      </w:r>
-      <w:r>
-        <w:t xml:space="preserve">. Fourth edition. Wolters Kluwer.</w:t>
-      </w:r>
-    </w:p>
-    <w:bookmarkEnd w:id="230"/>
-    <w:bookmarkStart w:id="232" w:name="ref-starmer-statquest"/>
-    <w:p>
-      <w:pPr>
-        <w:pStyle w:val="Bibliography"/>
-      </w:pPr>
-      <w:r>
-        <w:t xml:space="preserve">Starmer, Josh. n.d.</w:t>
-      </w:r>
-      <w:r>
-        <w:t xml:space="preserve"> </w:t>
-      </w:r>
-      <w:r>
-        <w:rPr>
-          <w:i/>
-          <w:iCs/>
-        </w:rPr>
-        <w:t xml:space="preserve">StatQuest</w:t>
-      </w:r>
-      <w:r>
-        <w:rPr>
-          <w:i/>
-          <w:iCs/>
-        </w:rPr>
-        <w:t xml:space="preserve"> </w:t>
-      </w:r>
-      <w:r>
-        <w:rPr>
-          <w:i/>
-          <w:iCs/>
-        </w:rPr>
-        <w:t xml:space="preserve">with</w:t>
-      </w:r>
-      <w:r>
-        <w:rPr>
-          <w:i/>
-          <w:iCs/>
-        </w:rPr>
-        <w:t xml:space="preserve"> </w:t>
-      </w:r>
-      <w:r>
-        <w:rPr>
-          <w:i/>
-          <w:iCs/>
-        </w:rPr>
-        <w:t xml:space="preserve">Josh</w:t>
-      </w:r>
-      <w:r>
-        <w:rPr>
-          <w:i/>
-          <w:iCs/>
-        </w:rPr>
-        <w:t xml:space="preserve"> </w:t>
-      </w:r>
-      <w:r>
-        <w:rPr>
-          <w:i/>
-          <w:iCs/>
-        </w:rPr>
-        <w:t xml:space="preserve">Starmer</w:t>
-      </w:r>
-      <w:r>
-        <w:t xml:space="preserve">. YouTube channel.</w:t>
-      </w:r>
-      <w:r>
-        <w:t xml:space="preserve"> </w:t>
-      </w:r>
-      <w:hyperlink r:id="rId231">
+      <w:hyperlink r:id="rId227">
         <w:r>
           <w:rPr>
             <w:rStyle w:val="Hyperlink"/>
@@ -56447,18 +56339,39 @@
           <w:t xml:space="preserve">https://statquest.org/</w:t>
         </w:r>
       </w:hyperlink>
-      <w:r>
-        <w:t xml:space="preserve">.</w:t>
-      </w:r>
     </w:p>
-    <w:bookmarkEnd w:id="232"/>
-    <w:bookmarkStart w:id="234" w:name="ref-vittinghoff2e"/>
+    <w:bookmarkEnd w:id="228"/>
+    <w:bookmarkStart w:id="230" w:name="ref-rosenman1975coronary"/>
     <w:p>
       <w:pPr>
         <w:pStyle w:val="Bibliography"/>
       </w:pPr>
       <w:r>
-        <w:t xml:space="preserve">Vittinghoff, Eric, David V Glidden, Stephen C Shiboski, and Charles E McCulloch. 2012.</w:t>
+        <w:t xml:space="preserve">[8]</w:t>
+      </w:r>
+      <w:r>
+        <w:t xml:space="preserve"> </w:t>
+      </w:r>
+      <w:r>
+        <w:t xml:space="preserve">	</w:t>
+      </w:r>
+      <w:r>
+        <w:t xml:space="preserve">R. H. Rosenman, R. J. Brand, C. D. Jenkins, M. Friedman, R. Straus, and M. Wurm,</w:t>
+      </w:r>
+      <w:r>
+        <w:t xml:space="preserve"> </w:t>
+      </w:r>
+      <w:r>
+        <w:t xml:space="preserve">“Coronary heart disease in the</w:t>
+      </w:r>
+      <w:r>
+        <w:t xml:space="preserve"> </w:t>
+      </w:r>
+      <w:r>
+        <w:t xml:space="preserve">Western Collaborative Group Study</w:t>
+      </w:r>
+      <w:r>
+        <w:t xml:space="preserve">: Final follow-up experience of 8 1/2 years,”</w:t>
       </w:r>
       <w:r>
         <w:t xml:space="preserve"> </w:t>
@@ -56468,10 +56381,122 @@
           <w:i/>
           <w:iCs/>
         </w:rPr>
-        <w:t xml:space="preserve">Regression Methods in Biostatistics: Linear, Logistic, Survival, and Repeated Measures Models</w:t>
-      </w:r>
-      <w:r>
-        <w:t xml:space="preserve">. 2nd ed. Springer.</w:t>
+        <w:t xml:space="preserve">JAMA</w:t>
+      </w:r>
+      <w:r>
+        <w:t xml:space="preserve">, vol. 233, no. 8, pp. 872–877, 1975, doi:</w:t>
+      </w:r>
+      <w:r>
+        <w:t xml:space="preserve"> </w:t>
+      </w:r>
+      <w:hyperlink r:id="rId229">
+        <w:r>
+          <w:rPr>
+            <w:rStyle w:val="Hyperlink"/>
+          </w:rPr>
+          <w:t xml:space="preserve">10.1001/jama.1975.03260080034016</w:t>
+        </w:r>
+      </w:hyperlink>
+      <w:r>
+        <w:t xml:space="preserve">.</w:t>
+      </w:r>
+    </w:p>
+    <w:bookmarkEnd w:id="230"/>
+    <w:bookmarkStart w:id="232" w:name="ref-LEEJAMES1994ORoR"/>
+    <w:p>
+      <w:pPr>
+        <w:pStyle w:val="Bibliography"/>
+      </w:pPr>
+      <w:r>
+        <w:t xml:space="preserve">[9]</w:t>
+      </w:r>
+      <w:r>
+        <w:t xml:space="preserve"> </w:t>
+      </w:r>
+      <w:r>
+        <w:t xml:space="preserve">	</w:t>
+      </w:r>
+      <w:r>
+        <w:t xml:space="preserve">J. Lee,</w:t>
+      </w:r>
+      <w:r>
+        <w:t xml:space="preserve"> </w:t>
+      </w:r>
+      <w:r>
+        <w:t xml:space="preserve">“Odds ratio or relative risk for cross-sectional data?”</w:t>
+      </w:r>
+      <w:r>
+        <w:t xml:space="preserve"> </w:t>
+      </w:r>
+      <w:r>
+        <w:rPr>
+          <w:i/>
+          <w:iCs/>
+        </w:rPr>
+        <w:t xml:space="preserve">International journal of epidemiology</w:t>
+      </w:r>
+      <w:r>
+        <w:t xml:space="preserve">, vol. 23, no. 1, pp. 201–203, 1994, doi:</w:t>
+      </w:r>
+      <w:r>
+        <w:t xml:space="preserve"> </w:t>
+      </w:r>
+      <w:hyperlink r:id="rId231">
+        <w:r>
+          <w:rPr>
+            <w:rStyle w:val="Hyperlink"/>
+          </w:rPr>
+          <w:t xml:space="preserve">10.1093/ije/23.1.201</w:t>
+        </w:r>
+      </w:hyperlink>
+      <w:r>
+        <w:t xml:space="preserve">.</w:t>
+      </w:r>
+    </w:p>
+    <w:bookmarkEnd w:id="232"/>
+    <w:bookmarkStart w:id="234" w:name="ref-lumleyComplexSurveys2010"/>
+    <w:p>
+      <w:pPr>
+        <w:pStyle w:val="Bibliography"/>
+      </w:pPr>
+      <w:r>
+        <w:t xml:space="preserve">[10]</w:t>
+      </w:r>
+      <w:r>
+        <w:t xml:space="preserve"> </w:t>
+      </w:r>
+      <w:r>
+        <w:t xml:space="preserve">	</w:t>
+      </w:r>
+      <w:r>
+        <w:t xml:space="preserve">T. Lumley,</w:t>
+      </w:r>
+      <w:r>
+        <w:t xml:space="preserve"> </w:t>
+      </w:r>
+      <w:r>
+        <w:rPr>
+          <w:i/>
+          <w:iCs/>
+        </w:rPr>
+        <w:t xml:space="preserve">Complex surveys : A guide to analysis using</w:t>
+      </w:r>
+      <w:r>
+        <w:rPr>
+          <w:i/>
+          <w:iCs/>
+        </w:rPr>
+        <w:t xml:space="preserve"> </w:t>
+      </w:r>
+      <w:r>
+        <w:rPr>
+          <w:i/>
+          <w:iCs/>
+        </w:rPr>
+        <w:t xml:space="preserve">R</w:t>
+      </w:r>
+      <w:r>
+        <w:t xml:space="preserve">. in Wiley series in survey methodology. Hoboken, N.J: John Wiley, 2010. doi:</w:t>
       </w:r>
       <w:r>
         <w:t xml:space="preserve"> </w:t>
@@ -56481,7 +56506,7 @@
           <w:rPr>
             <w:rStyle w:val="Hyperlink"/>
           </w:rPr>
-          <w:t xml:space="preserve">https://doi.org/10.1007/978-1-4614-1353-0</w:t>
+          <w:t xml:space="preserve">10.1002/9780470580066</w:t>
         </w:r>
       </w:hyperlink>
       <w:r>

</xml_diff>

<commit_message>
Deploying to gh-pages from @ Morrison-Lab/rme@9054a41568f454c5b5e755fd8fe704728212804b 🚀
</commit_message>
<xml_diff>
--- a/chapters/binary-outcome-associations-handout.docx
+++ b/chapters/binary-outcome-associations-handout.docx
@@ -36863,7 +36863,78 @@
               <w:t xml:space="preserve">. </w:t>
             </w:r>
             <w:r>
-              <w:t xml:space="preserve">Apply the same steps as for</w:t>
+              <w:t xml:space="preserve">Condition every probability,</w:t>
+            </w:r>
+            <w:r>
+              <w:t xml:space="preserve"> </w:t>
+            </w:r>
+            <w:hyperlink w:anchor="def-odds">
+              <w:r>
+                <w:rPr>
+                  <w:rStyle w:val="Hyperlink"/>
+                </w:rPr>
+                <w:t xml:space="preserve">odds</w:t>
+              </w:r>
+            </w:hyperlink>
+            <w:r>
+              <w:t xml:space="preserve"> </w:t>
+            </w:r>
+            <w:r>
+              <w:t xml:space="preserve">and</w:t>
+            </w:r>
+            <w:r>
+              <w:t xml:space="preserve"> </w:t>
+            </w:r>
+            <w:hyperlink w:anchor="def-OR">
+              <w:r>
+                <w:rPr>
+                  <w:rStyle w:val="Hyperlink"/>
+                </w:rPr>
+                <w:t xml:space="preserve">odds ratio</w:t>
+              </w:r>
+            </w:hyperlink>
+            <w:r>
+              <w:t xml:space="preserve"> </w:t>
+            </w:r>
+            <w:r>
+              <w:t xml:space="preserve">on</w:t>
+            </w:r>
+            <w:r>
+              <w:t xml:space="preserve"> </w:t>
+            </w:r>
+            <m:oMath>
+              <m:r>
+                <m:t>C</m:t>
+              </m:r>
+            </m:oMath>
+            <w:r>
+              <w:t xml:space="preserve">.</w:t>
+            </w:r>
+            <w:r>
+              <w:t xml:space="preserve"> </w:t>
+            </w:r>
+            <w:r>
+              <w:t xml:space="preserve">The probabilities given</w:t>
+            </w:r>
+            <w:r>
+              <w:t xml:space="preserve"> </w:t>
+            </w:r>
+            <m:oMath>
+              <m:r>
+                <m:t>C</m:t>
+              </m:r>
+            </m:oMath>
+            <w:r>
+              <w:t xml:space="preserve"> </w:t>
+            </w:r>
+            <w:r>
+              <w:t xml:space="preserve">obey the same rules as unconditional probabilities,</w:t>
+            </w:r>
+            <w:r>
+              <w:t xml:space="preserve"> </w:t>
+            </w:r>
+            <w:r>
+              <w:t xml:space="preserve">so the steps in the proof of</w:t>
             </w:r>
             <w:r>
               <w:t xml:space="preserve"> </w:t>
@@ -36877,13 +36948,90 @@
               </w:r>
             </w:hyperlink>
             <w:r>
+              <w:t xml:space="preserve"> </w:t>
+            </w:r>
+            <w:r>
+              <w:t xml:space="preserve">apply to them.</w:t>
+            </w:r>
+            <w:r>
+              <w:t xml:space="preserve"> </w:t>
+            </w:r>
+            <w:r>
+              <w:t xml:space="preserve">Using</w:t>
+            </w:r>
+            <w:r>
+              <w:t xml:space="preserve"> </w:t>
+            </w:r>
+            <w:hyperlink w:anchor="def-OR">
+              <w:r>
+                <w:rPr>
+                  <w:rStyle w:val="Hyperlink"/>
+                </w:rPr>
+                <w:t xml:space="preserve">Definition 12</w:t>
+              </w:r>
+            </w:hyperlink>
+            <w:r>
               <w:t xml:space="preserve">,</w:t>
             </w:r>
             <w:r>
               <w:t xml:space="preserve"> </w:t>
             </w:r>
-            <w:r>
-              <w:t xml:space="preserve">inserting</w:t>
+            <w:hyperlink w:anchor="def-c-odds">
+              <w:r>
+                <w:rPr>
+                  <w:rStyle w:val="Hyperlink"/>
+                </w:rPr>
+                <w:t xml:space="preserve">Definition 9</w:t>
+              </w:r>
+            </w:hyperlink>
+            <w:r>
+              <w:t xml:space="preserve">,</w:t>
+            </w:r>
+            <w:r>
+              <w:t xml:space="preserve"> </w:t>
+            </w:r>
+            <w:r>
+              <w:t xml:space="preserve">the</w:t>
+            </w:r>
+            <w:r>
+              <w:t xml:space="preserve"> </w:t>
+            </w:r>
+            <w:hyperlink r:id="rId153">
+              <w:r>
+                <w:rPr>
+                  <w:rStyle w:val="Hyperlink"/>
+                </w:rPr>
+                <w:t xml:space="preserve">law of conditional probability</w:t>
+              </w:r>
+            </w:hyperlink>
+            <w:r>
+              <w:t xml:space="preserve">,</w:t>
+            </w:r>
+            <w:r>
+              <w:t xml:space="preserve"> </w:t>
+            </w:r>
+            <w:r>
+              <w:t xml:space="preserve">and the</w:t>
+            </w:r>
+            <w:r>
+              <w:t xml:space="preserve"> </w:t>
+            </w:r>
+            <w:hyperlink r:id="rId80">
+              <w:r>
+                <w:rPr>
+                  <w:rStyle w:val="Hyperlink"/>
+                </w:rPr>
+                <w:t xml:space="preserve">definition of conditional probability</w:t>
+              </w:r>
+            </w:hyperlink>
+            <w:r>
+              <w:t xml:space="preserve">,</w:t>
+            </w:r>
+            <w:r>
+              <w:t xml:space="preserve"> </w:t>
+            </w:r>
+            <w:r>
+              <w:t xml:space="preserve">each for the distribution given</w:t>
             </w:r>
             <w:r>
               <w:t xml:space="preserve"> </w:t>
@@ -36894,25 +37042,3552 @@
               </m:r>
             </m:oMath>
             <w:r>
-              <w:t xml:space="preserve"> </w:t>
-            </w:r>
-            <w:r>
-              <w:t xml:space="preserve">into the conditions (RHS of</w:t>
-            </w:r>
-            <w:r>
-              <w:t xml:space="preserve"> </w:t>
-            </w:r>
-            <m:oMath>
-              <m:r>
-                <m:rPr>
-                  <m:sty m:val="p"/>
-                </m:rPr>
-                <m:t>|</m:t>
-              </m:r>
-            </m:oMath>
-            <w:r>
-              <w:t xml:space="preserve">) of every expression.</w:t>
-            </w:r>
+              <w:t xml:space="preserve">:</w:t>
+            </w:r>
+          </w:p>
+          <w:p>
+            <w:pPr>
+              <w:pStyle w:val="BodyText"/>
+            </w:pPr>
+            <m:oMathPara>
+              <m:oMathParaPr>
+                <m:jc m:val="center"/>
+              </m:oMathParaPr>
+              <m:oMath>
+                <m:eqArr>
+                  <m:e>
+                    <m:sSub>
+                      <m:e>
+                        <m:r>
+                          <m:rPr>
+                            <m:nor/>
+                            <m:sty m:val="p"/>
+                          </m:rPr>
+                          <m:t>ϙ</m:t>
+                        </m:r>
+                      </m:e>
+                      <m:sub>
+                        <m:r>
+                          <m:t>ω</m:t>
+                        </m:r>
+                      </m:sub>
+                    </m:sSub>
+                    <m:r>
+                      <m:rPr>
+                        <m:sty m:val="p"/>
+                      </m:rPr>
+                      <m:t>(</m:t>
+                    </m:r>
+                    <m:r>
+                      <m:t>A</m:t>
+                    </m:r>
+                    <m:r>
+                      <m:rPr>
+                        <m:sty m:val="p"/>
+                      </m:rPr>
+                      <m:t>|</m:t>
+                    </m:r>
+                    <m:r>
+                      <m:t>B</m:t>
+                    </m:r>
+                    <m:r>
+                      <m:rPr>
+                        <m:sty m:val="p"/>
+                      </m:rPr>
+                      <m:t>,</m:t>
+                    </m:r>
+                    <m:r>
+                      <m:t>C</m:t>
+                    </m:r>
+                    <m:r>
+                      <m:rPr>
+                        <m:sty m:val="p"/>
+                      </m:rPr>
+                      <m:t>)</m:t>
+                    </m:r>
+                    <m:r>
+                      <m:t>&amp;</m:t>
+                    </m:r>
+                    <m:limUpp>
+                      <m:e>
+                        <m:r>
+                          <m:rPr>
+                            <m:sty m:val="p"/>
+                          </m:rPr>
+                          <m:t>=</m:t>
+                        </m:r>
+                      </m:e>
+                      <m:lim>
+                        <m:r>
+                          <m:rPr>
+                            <m:nor/>
+                            <m:sty m:val="p"/>
+                          </m:rPr>
+                          <m:t>def</m:t>
+                        </m:r>
+                      </m:lim>
+                    </m:limUpp>
+                    <m:f>
+                      <m:fPr>
+                        <m:type m:val="bar"/>
+                      </m:fPr>
+                      <m:num>
+                        <m:r>
+                          <m:t>ω</m:t>
+                        </m:r>
+                        <m:r>
+                          <m:rPr>
+                            <m:sty m:val="p"/>
+                          </m:rPr>
+                          <m:t>(</m:t>
+                        </m:r>
+                        <m:r>
+                          <m:t>A</m:t>
+                        </m:r>
+                        <m:r>
+                          <m:rPr>
+                            <m:sty m:val="p"/>
+                          </m:rPr>
+                          <m:t>|</m:t>
+                        </m:r>
+                        <m:r>
+                          <m:t>B</m:t>
+                        </m:r>
+                        <m:r>
+                          <m:rPr>
+                            <m:sty m:val="p"/>
+                          </m:rPr>
+                          <m:t>,</m:t>
+                        </m:r>
+                        <m:r>
+                          <m:t>C</m:t>
+                        </m:r>
+                        <m:r>
+                          <m:rPr>
+                            <m:sty m:val="p"/>
+                          </m:rPr>
+                          <m:t>)</m:t>
+                        </m:r>
+                      </m:num>
+                      <m:den>
+                        <m:r>
+                          <m:t>ω</m:t>
+                        </m:r>
+                        <m:r>
+                          <m:rPr>
+                            <m:sty m:val="p"/>
+                          </m:rPr>
+                          <m:t>(</m:t>
+                        </m:r>
+                        <m:r>
+                          <m:t>A</m:t>
+                        </m:r>
+                        <m:r>
+                          <m:rPr>
+                            <m:sty m:val="p"/>
+                          </m:rPr>
+                          <m:t>|</m:t>
+                        </m:r>
+                        <m:r>
+                          <m:rPr>
+                            <m:sty m:val="p"/>
+                          </m:rPr>
+                          <m:t>¬</m:t>
+                        </m:r>
+                        <m:r>
+                          <m:t>B</m:t>
+                        </m:r>
+                        <m:r>
+                          <m:rPr>
+                            <m:sty m:val="p"/>
+                          </m:rPr>
+                          <m:t>,</m:t>
+                        </m:r>
+                        <m:r>
+                          <m:t>C</m:t>
+                        </m:r>
+                        <m:r>
+                          <m:rPr>
+                            <m:sty m:val="p"/>
+                          </m:rPr>
+                          <m:t>)</m:t>
+                        </m:r>
+                      </m:den>
+                    </m:f>
+                    <m:r>
+                      <m:t>&amp;</m:t>
+                    </m:r>
+                    <m:r>
+                      <m:t>&amp;</m:t>
+                    </m:r>
+                    <m:r>
+                      <m:rPr>
+                        <m:nor/>
+                        <m:sty m:val="p"/>
+                      </m:rPr>
+                      <m:t>(definition of odds ratio)</m:t>
+                    </m:r>
+                  </m:e>
+                  <m:e>
+                    <m:r>
+                      <m:t>&amp;</m:t>
+                    </m:r>
+                    <m:r>
+                      <m:rPr>
+                        <m:sty m:val="p"/>
+                      </m:rPr>
+                      <m:t>=</m:t>
+                    </m:r>
+                    <m:f>
+                      <m:fPr>
+                        <m:type m:val="bar"/>
+                      </m:fPr>
+                      <m:num>
+                        <m:r>
+                          <m:t>​</m:t>
+                        </m:r>
+                        <m:d>
+                          <m:dPr>
+                            <m:begChr m:val="("/>
+                            <m:sepChr m:val=""/>
+                            <m:endChr m:val=")"/>
+                            <m:grow/>
+                          </m:dPr>
+                          <m:e>
+                            <m:f>
+                              <m:fPr>
+                                <m:type m:val="bar"/>
+                              </m:fPr>
+                              <m:num>
+                                <m:r>
+                                  <m:rPr>
+                                    <m:sty m:val="p"/>
+                                  </m:rPr>
+                                  <m:t>p</m:t>
+                                </m:r>
+                                <m:r>
+                                  <m:rPr>
+                                    <m:sty m:val="p"/>
+                                  </m:rPr>
+                                  <m:t>(</m:t>
+                                </m:r>
+                                <m:r>
+                                  <m:t>A</m:t>
+                                </m:r>
+                                <m:r>
+                                  <m:rPr>
+                                    <m:sty m:val="p"/>
+                                  </m:rPr>
+                                  <m:t>|</m:t>
+                                </m:r>
+                                <m:r>
+                                  <m:t>B</m:t>
+                                </m:r>
+                                <m:r>
+                                  <m:rPr>
+                                    <m:sty m:val="p"/>
+                                  </m:rPr>
+                                  <m:t>,</m:t>
+                                </m:r>
+                                <m:r>
+                                  <m:t>C</m:t>
+                                </m:r>
+                                <m:r>
+                                  <m:rPr>
+                                    <m:sty m:val="p"/>
+                                  </m:rPr>
+                                  <m:t>)</m:t>
+                                </m:r>
+                              </m:num>
+                              <m:den>
+                                <m:r>
+                                  <m:rPr>
+                                    <m:sty m:val="p"/>
+                                  </m:rPr>
+                                  <m:t>p</m:t>
+                                </m:r>
+                                <m:r>
+                                  <m:rPr>
+                                    <m:sty m:val="p"/>
+                                  </m:rPr>
+                                  <m:t>(</m:t>
+                                </m:r>
+                                <m:r>
+                                  <m:rPr>
+                                    <m:sty m:val="p"/>
+                                  </m:rPr>
+                                  <m:t>¬</m:t>
+                                </m:r>
+                                <m:r>
+                                  <m:t>A</m:t>
+                                </m:r>
+                                <m:r>
+                                  <m:rPr>
+                                    <m:sty m:val="p"/>
+                                  </m:rPr>
+                                  <m:t>|</m:t>
+                                </m:r>
+                                <m:r>
+                                  <m:t>B</m:t>
+                                </m:r>
+                                <m:r>
+                                  <m:rPr>
+                                    <m:sty m:val="p"/>
+                                  </m:rPr>
+                                  <m:t>,</m:t>
+                                </m:r>
+                                <m:r>
+                                  <m:t>C</m:t>
+                                </m:r>
+                                <m:r>
+                                  <m:rPr>
+                                    <m:sty m:val="p"/>
+                                  </m:rPr>
+                                  <m:t>)</m:t>
+                                </m:r>
+                              </m:den>
+                            </m:f>
+                          </m:e>
+                        </m:d>
+                        <m:r>
+                          <m:t>​</m:t>
+                        </m:r>
+                      </m:num>
+                      <m:den>
+                        <m:r>
+                          <m:t>​</m:t>
+                        </m:r>
+                        <m:d>
+                          <m:dPr>
+                            <m:begChr m:val="("/>
+                            <m:sepChr m:val=""/>
+                            <m:endChr m:val=")"/>
+                            <m:grow/>
+                          </m:dPr>
+                          <m:e>
+                            <m:f>
+                              <m:fPr>
+                                <m:type m:val="bar"/>
+                              </m:fPr>
+                              <m:num>
+                                <m:r>
+                                  <m:rPr>
+                                    <m:sty m:val="p"/>
+                                  </m:rPr>
+                                  <m:t>p</m:t>
+                                </m:r>
+                                <m:r>
+                                  <m:rPr>
+                                    <m:sty m:val="p"/>
+                                  </m:rPr>
+                                  <m:t>(</m:t>
+                                </m:r>
+                                <m:r>
+                                  <m:t>A</m:t>
+                                </m:r>
+                                <m:r>
+                                  <m:rPr>
+                                    <m:sty m:val="p"/>
+                                  </m:rPr>
+                                  <m:t>|</m:t>
+                                </m:r>
+                                <m:r>
+                                  <m:rPr>
+                                    <m:sty m:val="p"/>
+                                  </m:rPr>
+                                  <m:t>¬</m:t>
+                                </m:r>
+                                <m:r>
+                                  <m:t>B</m:t>
+                                </m:r>
+                                <m:r>
+                                  <m:rPr>
+                                    <m:sty m:val="p"/>
+                                  </m:rPr>
+                                  <m:t>,</m:t>
+                                </m:r>
+                                <m:r>
+                                  <m:t>C</m:t>
+                                </m:r>
+                                <m:r>
+                                  <m:rPr>
+                                    <m:sty m:val="p"/>
+                                  </m:rPr>
+                                  <m:t>)</m:t>
+                                </m:r>
+                              </m:num>
+                              <m:den>
+                                <m:r>
+                                  <m:rPr>
+                                    <m:sty m:val="p"/>
+                                  </m:rPr>
+                                  <m:t>p</m:t>
+                                </m:r>
+                                <m:r>
+                                  <m:rPr>
+                                    <m:sty m:val="p"/>
+                                  </m:rPr>
+                                  <m:t>(</m:t>
+                                </m:r>
+                                <m:r>
+                                  <m:rPr>
+                                    <m:sty m:val="p"/>
+                                  </m:rPr>
+                                  <m:t>¬</m:t>
+                                </m:r>
+                                <m:r>
+                                  <m:t>A</m:t>
+                                </m:r>
+                                <m:r>
+                                  <m:rPr>
+                                    <m:sty m:val="p"/>
+                                  </m:rPr>
+                                  <m:t>|</m:t>
+                                </m:r>
+                                <m:r>
+                                  <m:rPr>
+                                    <m:sty m:val="p"/>
+                                  </m:rPr>
+                                  <m:t>¬</m:t>
+                                </m:r>
+                                <m:r>
+                                  <m:t>B</m:t>
+                                </m:r>
+                                <m:r>
+                                  <m:rPr>
+                                    <m:sty m:val="p"/>
+                                  </m:rPr>
+                                  <m:t>,</m:t>
+                                </m:r>
+                                <m:r>
+                                  <m:t>C</m:t>
+                                </m:r>
+                                <m:r>
+                                  <m:rPr>
+                                    <m:sty m:val="p"/>
+                                  </m:rPr>
+                                  <m:t>)</m:t>
+                                </m:r>
+                              </m:den>
+                            </m:f>
+                          </m:e>
+                        </m:d>
+                        <m:r>
+                          <m:t>​</m:t>
+                        </m:r>
+                      </m:den>
+                    </m:f>
+                    <m:r>
+                      <m:t>&amp;</m:t>
+                    </m:r>
+                    <m:r>
+                      <m:t>&amp;</m:t>
+                    </m:r>
+                    <m:r>
+                      <m:rPr>
+                        <m:nor/>
+                        <m:sty m:val="p"/>
+                      </m:rPr>
+                      <m:t>(definition of conditional odds)</m:t>
+                    </m:r>
+                  </m:e>
+                  <m:e>
+                    <m:r>
+                      <m:t>&amp;</m:t>
+                    </m:r>
+                    <m:r>
+                      <m:rPr>
+                        <m:sty m:val="p"/>
+                      </m:rPr>
+                      <m:t>=</m:t>
+                    </m:r>
+                    <m:r>
+                      <m:t>​</m:t>
+                    </m:r>
+                    <m:d>
+                      <m:dPr>
+                        <m:begChr m:val="("/>
+                        <m:sepChr m:val=""/>
+                        <m:endChr m:val=")"/>
+                        <m:grow/>
+                      </m:dPr>
+                      <m:e>
+                        <m:f>
+                          <m:fPr>
+                            <m:type m:val="bar"/>
+                          </m:fPr>
+                          <m:num>
+                            <m:r>
+                              <m:rPr>
+                                <m:sty m:val="p"/>
+                              </m:rPr>
+                              <m:t>p</m:t>
+                            </m:r>
+                            <m:r>
+                              <m:rPr>
+                                <m:sty m:val="p"/>
+                              </m:rPr>
+                              <m:t>(</m:t>
+                            </m:r>
+                            <m:r>
+                              <m:t>A</m:t>
+                            </m:r>
+                            <m:r>
+                              <m:rPr>
+                                <m:sty m:val="p"/>
+                              </m:rPr>
+                              <m:t>|</m:t>
+                            </m:r>
+                            <m:r>
+                              <m:t>B</m:t>
+                            </m:r>
+                            <m:r>
+                              <m:rPr>
+                                <m:sty m:val="p"/>
+                              </m:rPr>
+                              <m:t>,</m:t>
+                            </m:r>
+                            <m:r>
+                              <m:t>C</m:t>
+                            </m:r>
+                            <m:r>
+                              <m:rPr>
+                                <m:sty m:val="p"/>
+                              </m:rPr>
+                              <m:t>)</m:t>
+                            </m:r>
+                          </m:num>
+                          <m:den>
+                            <m:r>
+                              <m:rPr>
+                                <m:sty m:val="p"/>
+                              </m:rPr>
+                              <m:t>p</m:t>
+                            </m:r>
+                            <m:r>
+                              <m:rPr>
+                                <m:sty m:val="p"/>
+                              </m:rPr>
+                              <m:t>(</m:t>
+                            </m:r>
+                            <m:r>
+                              <m:rPr>
+                                <m:sty m:val="p"/>
+                              </m:rPr>
+                              <m:t>¬</m:t>
+                            </m:r>
+                            <m:r>
+                              <m:t>A</m:t>
+                            </m:r>
+                            <m:r>
+                              <m:rPr>
+                                <m:sty m:val="p"/>
+                              </m:rPr>
+                              <m:t>|</m:t>
+                            </m:r>
+                            <m:r>
+                              <m:t>B</m:t>
+                            </m:r>
+                            <m:r>
+                              <m:rPr>
+                                <m:sty m:val="p"/>
+                              </m:rPr>
+                              <m:t>,</m:t>
+                            </m:r>
+                            <m:r>
+                              <m:t>C</m:t>
+                            </m:r>
+                            <m:r>
+                              <m:rPr>
+                                <m:sty m:val="p"/>
+                              </m:rPr>
+                              <m:t>)</m:t>
+                            </m:r>
+                          </m:den>
+                        </m:f>
+                      </m:e>
+                    </m:d>
+                    <m:r>
+                      <m:t>​</m:t>
+                    </m:r>
+                    <m:sSup>
+                      <m:e>
+                        <m:r>
+                          <m:t>​</m:t>
+                        </m:r>
+                        <m:d>
+                          <m:dPr>
+                            <m:begChr m:val="("/>
+                            <m:sepChr m:val=""/>
+                            <m:endChr m:val=")"/>
+                            <m:grow/>
+                          </m:dPr>
+                          <m:e>
+                            <m:f>
+                              <m:fPr>
+                                <m:type m:val="bar"/>
+                              </m:fPr>
+                              <m:num>
+                                <m:r>
+                                  <m:rPr>
+                                    <m:sty m:val="p"/>
+                                  </m:rPr>
+                                  <m:t>p</m:t>
+                                </m:r>
+                                <m:r>
+                                  <m:rPr>
+                                    <m:sty m:val="p"/>
+                                  </m:rPr>
+                                  <m:t>(</m:t>
+                                </m:r>
+                                <m:r>
+                                  <m:t>A</m:t>
+                                </m:r>
+                                <m:r>
+                                  <m:rPr>
+                                    <m:sty m:val="p"/>
+                                  </m:rPr>
+                                  <m:t>|</m:t>
+                                </m:r>
+                                <m:r>
+                                  <m:rPr>
+                                    <m:sty m:val="p"/>
+                                  </m:rPr>
+                                  <m:t>¬</m:t>
+                                </m:r>
+                                <m:r>
+                                  <m:t>B</m:t>
+                                </m:r>
+                                <m:r>
+                                  <m:rPr>
+                                    <m:sty m:val="p"/>
+                                  </m:rPr>
+                                  <m:t>,</m:t>
+                                </m:r>
+                                <m:r>
+                                  <m:t>C</m:t>
+                                </m:r>
+                                <m:r>
+                                  <m:rPr>
+                                    <m:sty m:val="p"/>
+                                  </m:rPr>
+                                  <m:t>)</m:t>
+                                </m:r>
+                              </m:num>
+                              <m:den>
+                                <m:r>
+                                  <m:rPr>
+                                    <m:sty m:val="p"/>
+                                  </m:rPr>
+                                  <m:t>p</m:t>
+                                </m:r>
+                                <m:r>
+                                  <m:rPr>
+                                    <m:sty m:val="p"/>
+                                  </m:rPr>
+                                  <m:t>(</m:t>
+                                </m:r>
+                                <m:r>
+                                  <m:rPr>
+                                    <m:sty m:val="p"/>
+                                  </m:rPr>
+                                  <m:t>¬</m:t>
+                                </m:r>
+                                <m:r>
+                                  <m:t>A</m:t>
+                                </m:r>
+                                <m:r>
+                                  <m:rPr>
+                                    <m:sty m:val="p"/>
+                                  </m:rPr>
+                                  <m:t>|</m:t>
+                                </m:r>
+                                <m:r>
+                                  <m:rPr>
+                                    <m:sty m:val="p"/>
+                                  </m:rPr>
+                                  <m:t>¬</m:t>
+                                </m:r>
+                                <m:r>
+                                  <m:t>B</m:t>
+                                </m:r>
+                                <m:r>
+                                  <m:rPr>
+                                    <m:sty m:val="p"/>
+                                  </m:rPr>
+                                  <m:t>,</m:t>
+                                </m:r>
+                                <m:r>
+                                  <m:t>C</m:t>
+                                </m:r>
+                                <m:r>
+                                  <m:rPr>
+                                    <m:sty m:val="p"/>
+                                  </m:rPr>
+                                  <m:t>)</m:t>
+                                </m:r>
+                              </m:den>
+                            </m:f>
+                          </m:e>
+                        </m:d>
+                        <m:r>
+                          <m:t>​</m:t>
+                        </m:r>
+                      </m:e>
+                      <m:sup>
+                        <m:r>
+                          <m:rPr>
+                            <m:sty m:val="p"/>
+                          </m:rPr>
+                          <m:t>−</m:t>
+                        </m:r>
+                        <m:r>
+                          <m:t>1</m:t>
+                        </m:r>
+                      </m:sup>
+                    </m:sSup>
+                    <m:r>
+                      <m:t>&amp;</m:t>
+                    </m:r>
+                    <m:r>
+                      <m:t>&amp;</m:t>
+                    </m:r>
+                    <m:r>
+                      <m:rPr>
+                        <m:nor/>
+                        <m:sty m:val="p"/>
+                      </m:rPr>
+                      <m:t>(division is multiplication by the reciprocal)</m:t>
+                    </m:r>
+                  </m:e>
+                  <m:e>
+                    <m:r>
+                      <m:t>&amp;</m:t>
+                    </m:r>
+                    <m:r>
+                      <m:rPr>
+                        <m:sty m:val="p"/>
+                      </m:rPr>
+                      <m:t>=</m:t>
+                    </m:r>
+                    <m:r>
+                      <m:t>​</m:t>
+                    </m:r>
+                    <m:d>
+                      <m:dPr>
+                        <m:begChr m:val="("/>
+                        <m:sepChr m:val=""/>
+                        <m:endChr m:val=")"/>
+                        <m:grow/>
+                      </m:dPr>
+                      <m:e>
+                        <m:f>
+                          <m:fPr>
+                            <m:type m:val="bar"/>
+                          </m:fPr>
+                          <m:num>
+                            <m:r>
+                              <m:rPr>
+                                <m:sty m:val="p"/>
+                              </m:rPr>
+                              <m:t>p</m:t>
+                            </m:r>
+                            <m:r>
+                              <m:rPr>
+                                <m:sty m:val="p"/>
+                              </m:rPr>
+                              <m:t>(</m:t>
+                            </m:r>
+                            <m:r>
+                              <m:t>A</m:t>
+                            </m:r>
+                            <m:r>
+                              <m:rPr>
+                                <m:sty m:val="p"/>
+                              </m:rPr>
+                              <m:t>|</m:t>
+                            </m:r>
+                            <m:r>
+                              <m:t>B</m:t>
+                            </m:r>
+                            <m:r>
+                              <m:rPr>
+                                <m:sty m:val="p"/>
+                              </m:rPr>
+                              <m:t>,</m:t>
+                            </m:r>
+                            <m:r>
+                              <m:t>C</m:t>
+                            </m:r>
+                            <m:r>
+                              <m:rPr>
+                                <m:sty m:val="p"/>
+                              </m:rPr>
+                              <m:t>)</m:t>
+                            </m:r>
+                          </m:num>
+                          <m:den>
+                            <m:r>
+                              <m:rPr>
+                                <m:sty m:val="p"/>
+                              </m:rPr>
+                              <m:t>p</m:t>
+                            </m:r>
+                            <m:r>
+                              <m:rPr>
+                                <m:sty m:val="p"/>
+                              </m:rPr>
+                              <m:t>(</m:t>
+                            </m:r>
+                            <m:r>
+                              <m:rPr>
+                                <m:sty m:val="p"/>
+                              </m:rPr>
+                              <m:t>¬</m:t>
+                            </m:r>
+                            <m:r>
+                              <m:t>A</m:t>
+                            </m:r>
+                            <m:r>
+                              <m:rPr>
+                                <m:sty m:val="p"/>
+                              </m:rPr>
+                              <m:t>|</m:t>
+                            </m:r>
+                            <m:r>
+                              <m:t>B</m:t>
+                            </m:r>
+                            <m:r>
+                              <m:rPr>
+                                <m:sty m:val="p"/>
+                              </m:rPr>
+                              <m:t>,</m:t>
+                            </m:r>
+                            <m:r>
+                              <m:t>C</m:t>
+                            </m:r>
+                            <m:r>
+                              <m:rPr>
+                                <m:sty m:val="p"/>
+                              </m:rPr>
+                              <m:t>)</m:t>
+                            </m:r>
+                          </m:den>
+                        </m:f>
+                      </m:e>
+                    </m:d>
+                    <m:r>
+                      <m:t>​</m:t>
+                    </m:r>
+                    <m:r>
+                      <m:t>​</m:t>
+                    </m:r>
+                    <m:d>
+                      <m:dPr>
+                        <m:begChr m:val="("/>
+                        <m:sepChr m:val=""/>
+                        <m:endChr m:val=")"/>
+                        <m:grow/>
+                      </m:dPr>
+                      <m:e>
+                        <m:f>
+                          <m:fPr>
+                            <m:type m:val="bar"/>
+                          </m:fPr>
+                          <m:num>
+                            <m:r>
+                              <m:rPr>
+                                <m:sty m:val="p"/>
+                              </m:rPr>
+                              <m:t>p</m:t>
+                            </m:r>
+                            <m:r>
+                              <m:rPr>
+                                <m:sty m:val="p"/>
+                              </m:rPr>
+                              <m:t>(</m:t>
+                            </m:r>
+                            <m:r>
+                              <m:rPr>
+                                <m:sty m:val="p"/>
+                              </m:rPr>
+                              <m:t>¬</m:t>
+                            </m:r>
+                            <m:r>
+                              <m:t>A</m:t>
+                            </m:r>
+                            <m:r>
+                              <m:rPr>
+                                <m:sty m:val="p"/>
+                              </m:rPr>
+                              <m:t>|</m:t>
+                            </m:r>
+                            <m:r>
+                              <m:rPr>
+                                <m:sty m:val="p"/>
+                              </m:rPr>
+                              <m:t>¬</m:t>
+                            </m:r>
+                            <m:r>
+                              <m:t>B</m:t>
+                            </m:r>
+                            <m:r>
+                              <m:rPr>
+                                <m:sty m:val="p"/>
+                              </m:rPr>
+                              <m:t>,</m:t>
+                            </m:r>
+                            <m:r>
+                              <m:t>C</m:t>
+                            </m:r>
+                            <m:r>
+                              <m:rPr>
+                                <m:sty m:val="p"/>
+                              </m:rPr>
+                              <m:t>)</m:t>
+                            </m:r>
+                          </m:num>
+                          <m:den>
+                            <m:r>
+                              <m:rPr>
+                                <m:sty m:val="p"/>
+                              </m:rPr>
+                              <m:t>p</m:t>
+                            </m:r>
+                            <m:r>
+                              <m:rPr>
+                                <m:sty m:val="p"/>
+                              </m:rPr>
+                              <m:t>(</m:t>
+                            </m:r>
+                            <m:r>
+                              <m:t>A</m:t>
+                            </m:r>
+                            <m:r>
+                              <m:rPr>
+                                <m:sty m:val="p"/>
+                              </m:rPr>
+                              <m:t>|</m:t>
+                            </m:r>
+                            <m:r>
+                              <m:rPr>
+                                <m:sty m:val="p"/>
+                              </m:rPr>
+                              <m:t>¬</m:t>
+                            </m:r>
+                            <m:r>
+                              <m:t>B</m:t>
+                            </m:r>
+                            <m:r>
+                              <m:rPr>
+                                <m:sty m:val="p"/>
+                              </m:rPr>
+                              <m:t>,</m:t>
+                            </m:r>
+                            <m:r>
+                              <m:t>C</m:t>
+                            </m:r>
+                            <m:r>
+                              <m:rPr>
+                                <m:sty m:val="p"/>
+                              </m:rPr>
+                              <m:t>)</m:t>
+                            </m:r>
+                          </m:den>
+                        </m:f>
+                      </m:e>
+                    </m:d>
+                    <m:r>
+                      <m:t>​</m:t>
+                    </m:r>
+                    <m:r>
+                      <m:t>&amp;</m:t>
+                    </m:r>
+                    <m:r>
+                      <m:t>&amp;</m:t>
+                    </m:r>
+                    <m:r>
+                      <m:rPr>
+                        <m:nor/>
+                        <m:sty m:val="p"/>
+                      </m:rPr>
+                      <m:t>(the reciprocal of a fraction flips it)</m:t>
+                    </m:r>
+                  </m:e>
+                  <m:e>
+                    <m:r>
+                      <m:t>&amp;</m:t>
+                    </m:r>
+                    <m:r>
+                      <m:rPr>
+                        <m:sty m:val="p"/>
+                      </m:rPr>
+                      <m:t>=</m:t>
+                    </m:r>
+                    <m:r>
+                      <m:t>​</m:t>
+                    </m:r>
+                    <m:d>
+                      <m:dPr>
+                        <m:begChr m:val="("/>
+                        <m:sepChr m:val=""/>
+                        <m:endChr m:val=")"/>
+                        <m:grow/>
+                      </m:dPr>
+                      <m:e>
+                        <m:f>
+                          <m:fPr>
+                            <m:type m:val="bar"/>
+                          </m:fPr>
+                          <m:num>
+                            <m:r>
+                              <m:rPr>
+                                <m:sty m:val="p"/>
+                              </m:rPr>
+                              <m:t>p</m:t>
+                            </m:r>
+                            <m:r>
+                              <m:rPr>
+                                <m:sty m:val="p"/>
+                              </m:rPr>
+                              <m:t>(</m:t>
+                            </m:r>
+                            <m:r>
+                              <m:t>A</m:t>
+                            </m:r>
+                            <m:r>
+                              <m:rPr>
+                                <m:sty m:val="p"/>
+                              </m:rPr>
+                              <m:t>|</m:t>
+                            </m:r>
+                            <m:r>
+                              <m:t>B</m:t>
+                            </m:r>
+                            <m:r>
+                              <m:rPr>
+                                <m:sty m:val="p"/>
+                              </m:rPr>
+                              <m:t>,</m:t>
+                            </m:r>
+                            <m:r>
+                              <m:t>C</m:t>
+                            </m:r>
+                            <m:r>
+                              <m:rPr>
+                                <m:sty m:val="p"/>
+                              </m:rPr>
+                              <m:t>)</m:t>
+                            </m:r>
+                          </m:num>
+                          <m:den>
+                            <m:r>
+                              <m:rPr>
+                                <m:sty m:val="p"/>
+                              </m:rPr>
+                              <m:t>p</m:t>
+                            </m:r>
+                            <m:r>
+                              <m:rPr>
+                                <m:sty m:val="p"/>
+                              </m:rPr>
+                              <m:t>(</m:t>
+                            </m:r>
+                            <m:r>
+                              <m:rPr>
+                                <m:sty m:val="p"/>
+                              </m:rPr>
+                              <m:t>¬</m:t>
+                            </m:r>
+                            <m:r>
+                              <m:t>A</m:t>
+                            </m:r>
+                            <m:r>
+                              <m:rPr>
+                                <m:sty m:val="p"/>
+                              </m:rPr>
+                              <m:t>|</m:t>
+                            </m:r>
+                            <m:r>
+                              <m:t>B</m:t>
+                            </m:r>
+                            <m:r>
+                              <m:rPr>
+                                <m:sty m:val="p"/>
+                              </m:rPr>
+                              <m:t>,</m:t>
+                            </m:r>
+                            <m:r>
+                              <m:t>C</m:t>
+                            </m:r>
+                            <m:r>
+                              <m:rPr>
+                                <m:sty m:val="p"/>
+                              </m:rPr>
+                              <m:t>)</m:t>
+                            </m:r>
+                          </m:den>
+                        </m:f>
+                        <m:r>
+                          <m:rPr>
+                            <m:sty m:val="p"/>
+                          </m:rPr>
+                          <m:t>⋅</m:t>
+                        </m:r>
+                        <m:f>
+                          <m:fPr>
+                            <m:type m:val="bar"/>
+                          </m:fPr>
+                          <m:num>
+                            <m:r>
+                              <m:rPr>
+                                <m:sty m:val="p"/>
+                              </m:rPr>
+                              <m:t>p</m:t>
+                            </m:r>
+                            <m:r>
+                              <m:rPr>
+                                <m:sty m:val="p"/>
+                              </m:rPr>
+                              <m:t>(</m:t>
+                            </m:r>
+                            <m:r>
+                              <m:t>B</m:t>
+                            </m:r>
+                            <m:r>
+                              <m:rPr>
+                                <m:sty m:val="p"/>
+                              </m:rPr>
+                              <m:t>∣</m:t>
+                            </m:r>
+                            <m:r>
+                              <m:t>C</m:t>
+                            </m:r>
+                            <m:r>
+                              <m:rPr>
+                                <m:sty m:val="p"/>
+                              </m:rPr>
+                              <m:t>)</m:t>
+                            </m:r>
+                          </m:num>
+                          <m:den>
+                            <m:r>
+                              <m:rPr>
+                                <m:sty m:val="p"/>
+                              </m:rPr>
+                              <m:t>p</m:t>
+                            </m:r>
+                            <m:r>
+                              <m:rPr>
+                                <m:sty m:val="p"/>
+                              </m:rPr>
+                              <m:t>(</m:t>
+                            </m:r>
+                            <m:r>
+                              <m:t>B</m:t>
+                            </m:r>
+                            <m:r>
+                              <m:rPr>
+                                <m:sty m:val="p"/>
+                              </m:rPr>
+                              <m:t>∣</m:t>
+                            </m:r>
+                            <m:r>
+                              <m:t>C</m:t>
+                            </m:r>
+                            <m:r>
+                              <m:rPr>
+                                <m:sty m:val="p"/>
+                              </m:rPr>
+                              <m:t>)</m:t>
+                            </m:r>
+                          </m:den>
+                        </m:f>
+                      </m:e>
+                    </m:d>
+                    <m:r>
+                      <m:t>​</m:t>
+                    </m:r>
+                    <m:r>
+                      <m:t>​</m:t>
+                    </m:r>
+                    <m:d>
+                      <m:dPr>
+                        <m:begChr m:val="("/>
+                        <m:sepChr m:val=""/>
+                        <m:endChr m:val=")"/>
+                        <m:grow/>
+                      </m:dPr>
+                      <m:e>
+                        <m:f>
+                          <m:fPr>
+                            <m:type m:val="bar"/>
+                          </m:fPr>
+                          <m:num>
+                            <m:r>
+                              <m:rPr>
+                                <m:sty m:val="p"/>
+                              </m:rPr>
+                              <m:t>p</m:t>
+                            </m:r>
+                            <m:r>
+                              <m:rPr>
+                                <m:sty m:val="p"/>
+                              </m:rPr>
+                              <m:t>(</m:t>
+                            </m:r>
+                            <m:r>
+                              <m:rPr>
+                                <m:sty m:val="p"/>
+                              </m:rPr>
+                              <m:t>¬</m:t>
+                            </m:r>
+                            <m:r>
+                              <m:t>A</m:t>
+                            </m:r>
+                            <m:r>
+                              <m:rPr>
+                                <m:sty m:val="p"/>
+                              </m:rPr>
+                              <m:t>|</m:t>
+                            </m:r>
+                            <m:r>
+                              <m:rPr>
+                                <m:sty m:val="p"/>
+                              </m:rPr>
+                              <m:t>¬</m:t>
+                            </m:r>
+                            <m:r>
+                              <m:t>B</m:t>
+                            </m:r>
+                            <m:r>
+                              <m:rPr>
+                                <m:sty m:val="p"/>
+                              </m:rPr>
+                              <m:t>,</m:t>
+                            </m:r>
+                            <m:r>
+                              <m:t>C</m:t>
+                            </m:r>
+                            <m:r>
+                              <m:rPr>
+                                <m:sty m:val="p"/>
+                              </m:rPr>
+                              <m:t>)</m:t>
+                            </m:r>
+                          </m:num>
+                          <m:den>
+                            <m:r>
+                              <m:rPr>
+                                <m:sty m:val="p"/>
+                              </m:rPr>
+                              <m:t>p</m:t>
+                            </m:r>
+                            <m:r>
+                              <m:rPr>
+                                <m:sty m:val="p"/>
+                              </m:rPr>
+                              <m:t>(</m:t>
+                            </m:r>
+                            <m:r>
+                              <m:t>A</m:t>
+                            </m:r>
+                            <m:r>
+                              <m:rPr>
+                                <m:sty m:val="p"/>
+                              </m:rPr>
+                              <m:t>|</m:t>
+                            </m:r>
+                            <m:r>
+                              <m:rPr>
+                                <m:sty m:val="p"/>
+                              </m:rPr>
+                              <m:t>¬</m:t>
+                            </m:r>
+                            <m:r>
+                              <m:t>B</m:t>
+                            </m:r>
+                            <m:r>
+                              <m:rPr>
+                                <m:sty m:val="p"/>
+                              </m:rPr>
+                              <m:t>,</m:t>
+                            </m:r>
+                            <m:r>
+                              <m:t>C</m:t>
+                            </m:r>
+                            <m:r>
+                              <m:rPr>
+                                <m:sty m:val="p"/>
+                              </m:rPr>
+                              <m:t>)</m:t>
+                            </m:r>
+                          </m:den>
+                        </m:f>
+                        <m:r>
+                          <m:rPr>
+                            <m:sty m:val="p"/>
+                          </m:rPr>
+                          <m:t>⋅</m:t>
+                        </m:r>
+                        <m:f>
+                          <m:fPr>
+                            <m:type m:val="bar"/>
+                          </m:fPr>
+                          <m:num>
+                            <m:r>
+                              <m:rPr>
+                                <m:sty m:val="p"/>
+                              </m:rPr>
+                              <m:t>p</m:t>
+                            </m:r>
+                            <m:r>
+                              <m:rPr>
+                                <m:sty m:val="p"/>
+                              </m:rPr>
+                              <m:t>(</m:t>
+                            </m:r>
+                            <m:r>
+                              <m:rPr>
+                                <m:sty m:val="p"/>
+                              </m:rPr>
+                              <m:t>¬</m:t>
+                            </m:r>
+                            <m:r>
+                              <m:t>B</m:t>
+                            </m:r>
+                            <m:r>
+                              <m:rPr>
+                                <m:sty m:val="p"/>
+                              </m:rPr>
+                              <m:t>∣</m:t>
+                            </m:r>
+                            <m:r>
+                              <m:t>C</m:t>
+                            </m:r>
+                            <m:r>
+                              <m:rPr>
+                                <m:sty m:val="p"/>
+                              </m:rPr>
+                              <m:t>)</m:t>
+                            </m:r>
+                          </m:num>
+                          <m:den>
+                            <m:r>
+                              <m:rPr>
+                                <m:sty m:val="p"/>
+                              </m:rPr>
+                              <m:t>p</m:t>
+                            </m:r>
+                            <m:r>
+                              <m:rPr>
+                                <m:sty m:val="p"/>
+                              </m:rPr>
+                              <m:t>(</m:t>
+                            </m:r>
+                            <m:r>
+                              <m:rPr>
+                                <m:sty m:val="p"/>
+                              </m:rPr>
+                              <m:t>¬</m:t>
+                            </m:r>
+                            <m:r>
+                              <m:t>B</m:t>
+                            </m:r>
+                            <m:r>
+                              <m:rPr>
+                                <m:sty m:val="p"/>
+                              </m:rPr>
+                              <m:t>∣</m:t>
+                            </m:r>
+                            <m:r>
+                              <m:t>C</m:t>
+                            </m:r>
+                            <m:r>
+                              <m:rPr>
+                                <m:sty m:val="p"/>
+                              </m:rPr>
+                              <m:t>)</m:t>
+                            </m:r>
+                          </m:den>
+                        </m:f>
+                      </m:e>
+                    </m:d>
+                    <m:r>
+                      <m:t>​</m:t>
+                    </m:r>
+                    <m:r>
+                      <m:t>&amp;</m:t>
+                    </m:r>
+                    <m:r>
+                      <m:t>&amp;</m:t>
+                    </m:r>
+                    <m:r>
+                      <m:rPr>
+                        <m:nor/>
+                        <m:sty m:val="p"/>
+                      </m:rPr>
+                      <m:t>(multiply each factor by 1)</m:t>
+                    </m:r>
+                  </m:e>
+                  <m:e>
+                    <m:r>
+                      <m:t>&amp;</m:t>
+                    </m:r>
+                    <m:r>
+                      <m:rPr>
+                        <m:sty m:val="p"/>
+                      </m:rPr>
+                      <m:t>=</m:t>
+                    </m:r>
+                    <m:r>
+                      <m:t>​</m:t>
+                    </m:r>
+                    <m:d>
+                      <m:dPr>
+                        <m:begChr m:val="("/>
+                        <m:sepChr m:val=""/>
+                        <m:endChr m:val=")"/>
+                        <m:grow/>
+                      </m:dPr>
+                      <m:e>
+                        <m:f>
+                          <m:fPr>
+                            <m:type m:val="bar"/>
+                          </m:fPr>
+                          <m:num>
+                            <m:r>
+                              <m:rPr>
+                                <m:sty m:val="p"/>
+                              </m:rPr>
+                              <m:t>p</m:t>
+                            </m:r>
+                            <m:r>
+                              <m:rPr>
+                                <m:sty m:val="p"/>
+                              </m:rPr>
+                              <m:t>(</m:t>
+                            </m:r>
+                            <m:r>
+                              <m:t>A</m:t>
+                            </m:r>
+                            <m:r>
+                              <m:rPr>
+                                <m:sty m:val="p"/>
+                              </m:rPr>
+                              <m:t>,</m:t>
+                            </m:r>
+                            <m:r>
+                              <m:t>B</m:t>
+                            </m:r>
+                            <m:r>
+                              <m:rPr>
+                                <m:sty m:val="p"/>
+                              </m:rPr>
+                              <m:t>∣</m:t>
+                            </m:r>
+                            <m:r>
+                              <m:t>C</m:t>
+                            </m:r>
+                            <m:r>
+                              <m:rPr>
+                                <m:sty m:val="p"/>
+                              </m:rPr>
+                              <m:t>)</m:t>
+                            </m:r>
+                          </m:num>
+                          <m:den>
+                            <m:r>
+                              <m:rPr>
+                                <m:sty m:val="p"/>
+                              </m:rPr>
+                              <m:t>p</m:t>
+                            </m:r>
+                            <m:r>
+                              <m:rPr>
+                                <m:sty m:val="p"/>
+                              </m:rPr>
+                              <m:t>(</m:t>
+                            </m:r>
+                            <m:r>
+                              <m:rPr>
+                                <m:sty m:val="p"/>
+                              </m:rPr>
+                              <m:t>¬</m:t>
+                            </m:r>
+                            <m:r>
+                              <m:t>A</m:t>
+                            </m:r>
+                            <m:r>
+                              <m:rPr>
+                                <m:sty m:val="p"/>
+                              </m:rPr>
+                              <m:t>,</m:t>
+                            </m:r>
+                            <m:r>
+                              <m:t>B</m:t>
+                            </m:r>
+                            <m:r>
+                              <m:rPr>
+                                <m:sty m:val="p"/>
+                              </m:rPr>
+                              <m:t>∣</m:t>
+                            </m:r>
+                            <m:r>
+                              <m:t>C</m:t>
+                            </m:r>
+                            <m:r>
+                              <m:rPr>
+                                <m:sty m:val="p"/>
+                              </m:rPr>
+                              <m:t>)</m:t>
+                            </m:r>
+                          </m:den>
+                        </m:f>
+                      </m:e>
+                    </m:d>
+                    <m:r>
+                      <m:t>​</m:t>
+                    </m:r>
+                    <m:r>
+                      <m:t>​</m:t>
+                    </m:r>
+                    <m:d>
+                      <m:dPr>
+                        <m:begChr m:val="("/>
+                        <m:sepChr m:val=""/>
+                        <m:endChr m:val=")"/>
+                        <m:grow/>
+                      </m:dPr>
+                      <m:e>
+                        <m:f>
+                          <m:fPr>
+                            <m:type m:val="bar"/>
+                          </m:fPr>
+                          <m:num>
+                            <m:r>
+                              <m:rPr>
+                                <m:sty m:val="p"/>
+                              </m:rPr>
+                              <m:t>p</m:t>
+                            </m:r>
+                            <m:r>
+                              <m:rPr>
+                                <m:sty m:val="p"/>
+                              </m:rPr>
+                              <m:t>(</m:t>
+                            </m:r>
+                            <m:r>
+                              <m:rPr>
+                                <m:sty m:val="p"/>
+                              </m:rPr>
+                              <m:t>¬</m:t>
+                            </m:r>
+                            <m:r>
+                              <m:t>A</m:t>
+                            </m:r>
+                            <m:r>
+                              <m:rPr>
+                                <m:sty m:val="p"/>
+                              </m:rPr>
+                              <m:t>,</m:t>
+                            </m:r>
+                            <m:r>
+                              <m:rPr>
+                                <m:sty m:val="p"/>
+                              </m:rPr>
+                              <m:t>¬</m:t>
+                            </m:r>
+                            <m:r>
+                              <m:t>B</m:t>
+                            </m:r>
+                            <m:r>
+                              <m:rPr>
+                                <m:sty m:val="p"/>
+                              </m:rPr>
+                              <m:t>∣</m:t>
+                            </m:r>
+                            <m:r>
+                              <m:t>C</m:t>
+                            </m:r>
+                            <m:r>
+                              <m:rPr>
+                                <m:sty m:val="p"/>
+                              </m:rPr>
+                              <m:t>)</m:t>
+                            </m:r>
+                          </m:num>
+                          <m:den>
+                            <m:r>
+                              <m:rPr>
+                                <m:sty m:val="p"/>
+                              </m:rPr>
+                              <m:t>p</m:t>
+                            </m:r>
+                            <m:r>
+                              <m:rPr>
+                                <m:sty m:val="p"/>
+                              </m:rPr>
+                              <m:t>(</m:t>
+                            </m:r>
+                            <m:r>
+                              <m:t>A</m:t>
+                            </m:r>
+                            <m:r>
+                              <m:rPr>
+                                <m:sty m:val="p"/>
+                              </m:rPr>
+                              <m:t>,</m:t>
+                            </m:r>
+                            <m:r>
+                              <m:rPr>
+                                <m:sty m:val="p"/>
+                              </m:rPr>
+                              <m:t>¬</m:t>
+                            </m:r>
+                            <m:r>
+                              <m:t>B</m:t>
+                            </m:r>
+                            <m:r>
+                              <m:rPr>
+                                <m:sty m:val="p"/>
+                              </m:rPr>
+                              <m:t>∣</m:t>
+                            </m:r>
+                            <m:r>
+                              <m:t>C</m:t>
+                            </m:r>
+                            <m:r>
+                              <m:rPr>
+                                <m:sty m:val="p"/>
+                              </m:rPr>
+                              <m:t>)</m:t>
+                            </m:r>
+                          </m:den>
+                        </m:f>
+                      </m:e>
+                    </m:d>
+                    <m:r>
+                      <m:t>​</m:t>
+                    </m:r>
+                    <m:r>
+                      <m:t>&amp;</m:t>
+                    </m:r>
+                    <m:r>
+                      <m:t>&amp;</m:t>
+                    </m:r>
+                    <m:r>
+                      <m:rPr>
+                        <m:nor/>
+                        <m:sty m:val="p"/>
+                      </m:rPr>
+                      <m:t>(law of conditional probability, in each of the four terms)</m:t>
+                    </m:r>
+                  </m:e>
+                  <m:e>
+                    <m:r>
+                      <m:t>&amp;</m:t>
+                    </m:r>
+                    <m:r>
+                      <m:rPr>
+                        <m:sty m:val="p"/>
+                      </m:rPr>
+                      <m:t>=</m:t>
+                    </m:r>
+                    <m:r>
+                      <m:t>​</m:t>
+                    </m:r>
+                    <m:d>
+                      <m:dPr>
+                        <m:begChr m:val="("/>
+                        <m:sepChr m:val=""/>
+                        <m:endChr m:val=")"/>
+                        <m:grow/>
+                      </m:dPr>
+                      <m:e>
+                        <m:f>
+                          <m:fPr>
+                            <m:type m:val="bar"/>
+                          </m:fPr>
+                          <m:num>
+                            <m:r>
+                              <m:rPr>
+                                <m:sty m:val="p"/>
+                              </m:rPr>
+                              <m:t>p</m:t>
+                            </m:r>
+                            <m:r>
+                              <m:rPr>
+                                <m:sty m:val="p"/>
+                              </m:rPr>
+                              <m:t>(</m:t>
+                            </m:r>
+                            <m:r>
+                              <m:t>B</m:t>
+                            </m:r>
+                            <m:r>
+                              <m:rPr>
+                                <m:sty m:val="p"/>
+                              </m:rPr>
+                              <m:t>,</m:t>
+                            </m:r>
+                            <m:r>
+                              <m:t>A</m:t>
+                            </m:r>
+                            <m:r>
+                              <m:rPr>
+                                <m:sty m:val="p"/>
+                              </m:rPr>
+                              <m:t>∣</m:t>
+                            </m:r>
+                            <m:r>
+                              <m:t>C</m:t>
+                            </m:r>
+                            <m:r>
+                              <m:rPr>
+                                <m:sty m:val="p"/>
+                              </m:rPr>
+                              <m:t>)</m:t>
+                            </m:r>
+                          </m:num>
+                          <m:den>
+                            <m:r>
+                              <m:rPr>
+                                <m:sty m:val="p"/>
+                              </m:rPr>
+                              <m:t>p</m:t>
+                            </m:r>
+                            <m:r>
+                              <m:rPr>
+                                <m:sty m:val="p"/>
+                              </m:rPr>
+                              <m:t>(</m:t>
+                            </m:r>
+                            <m:r>
+                              <m:t>B</m:t>
+                            </m:r>
+                            <m:r>
+                              <m:rPr>
+                                <m:sty m:val="p"/>
+                              </m:rPr>
+                              <m:t>,</m:t>
+                            </m:r>
+                            <m:r>
+                              <m:rPr>
+                                <m:sty m:val="p"/>
+                              </m:rPr>
+                              <m:t>¬</m:t>
+                            </m:r>
+                            <m:r>
+                              <m:t>A</m:t>
+                            </m:r>
+                            <m:r>
+                              <m:rPr>
+                                <m:sty m:val="p"/>
+                              </m:rPr>
+                              <m:t>∣</m:t>
+                            </m:r>
+                            <m:r>
+                              <m:t>C</m:t>
+                            </m:r>
+                            <m:r>
+                              <m:rPr>
+                                <m:sty m:val="p"/>
+                              </m:rPr>
+                              <m:t>)</m:t>
+                            </m:r>
+                          </m:den>
+                        </m:f>
+                      </m:e>
+                    </m:d>
+                    <m:r>
+                      <m:t>​</m:t>
+                    </m:r>
+                    <m:r>
+                      <m:t>​</m:t>
+                    </m:r>
+                    <m:d>
+                      <m:dPr>
+                        <m:begChr m:val="("/>
+                        <m:sepChr m:val=""/>
+                        <m:endChr m:val=")"/>
+                        <m:grow/>
+                      </m:dPr>
+                      <m:e>
+                        <m:f>
+                          <m:fPr>
+                            <m:type m:val="bar"/>
+                          </m:fPr>
+                          <m:num>
+                            <m:r>
+                              <m:rPr>
+                                <m:sty m:val="p"/>
+                              </m:rPr>
+                              <m:t>p</m:t>
+                            </m:r>
+                            <m:r>
+                              <m:rPr>
+                                <m:sty m:val="p"/>
+                              </m:rPr>
+                              <m:t>(</m:t>
+                            </m:r>
+                            <m:r>
+                              <m:rPr>
+                                <m:sty m:val="p"/>
+                              </m:rPr>
+                              <m:t>¬</m:t>
+                            </m:r>
+                            <m:r>
+                              <m:t>B</m:t>
+                            </m:r>
+                            <m:r>
+                              <m:rPr>
+                                <m:sty m:val="p"/>
+                              </m:rPr>
+                              <m:t>,</m:t>
+                            </m:r>
+                            <m:r>
+                              <m:rPr>
+                                <m:sty m:val="p"/>
+                              </m:rPr>
+                              <m:t>¬</m:t>
+                            </m:r>
+                            <m:r>
+                              <m:t>A</m:t>
+                            </m:r>
+                            <m:r>
+                              <m:rPr>
+                                <m:sty m:val="p"/>
+                              </m:rPr>
+                              <m:t>∣</m:t>
+                            </m:r>
+                            <m:r>
+                              <m:t>C</m:t>
+                            </m:r>
+                            <m:r>
+                              <m:rPr>
+                                <m:sty m:val="p"/>
+                              </m:rPr>
+                              <m:t>)</m:t>
+                            </m:r>
+                          </m:num>
+                          <m:den>
+                            <m:r>
+                              <m:rPr>
+                                <m:sty m:val="p"/>
+                              </m:rPr>
+                              <m:t>p</m:t>
+                            </m:r>
+                            <m:r>
+                              <m:rPr>
+                                <m:sty m:val="p"/>
+                              </m:rPr>
+                              <m:t>(</m:t>
+                            </m:r>
+                            <m:r>
+                              <m:rPr>
+                                <m:sty m:val="p"/>
+                              </m:rPr>
+                              <m:t>¬</m:t>
+                            </m:r>
+                            <m:r>
+                              <m:t>B</m:t>
+                            </m:r>
+                            <m:r>
+                              <m:rPr>
+                                <m:sty m:val="p"/>
+                              </m:rPr>
+                              <m:t>,</m:t>
+                            </m:r>
+                            <m:r>
+                              <m:t>A</m:t>
+                            </m:r>
+                            <m:r>
+                              <m:rPr>
+                                <m:sty m:val="p"/>
+                              </m:rPr>
+                              <m:t>∣</m:t>
+                            </m:r>
+                            <m:r>
+                              <m:t>C</m:t>
+                            </m:r>
+                            <m:r>
+                              <m:rPr>
+                                <m:sty m:val="p"/>
+                              </m:rPr>
+                              <m:t>)</m:t>
+                            </m:r>
+                          </m:den>
+                        </m:f>
+                      </m:e>
+                    </m:d>
+                    <m:r>
+                      <m:t>​</m:t>
+                    </m:r>
+                    <m:r>
+                      <m:t>&amp;</m:t>
+                    </m:r>
+                    <m:r>
+                      <m:t>&amp;</m:t>
+                    </m:r>
+                    <m:r>
+                      <m:rPr>
+                        <m:nor/>
+                        <m:sty m:val="p"/>
+                      </m:rPr>
+                      <m:t>(joint probabilities are symmetric in their arguments)</m:t>
+                    </m:r>
+                  </m:e>
+                  <m:e>
+                    <m:r>
+                      <m:t>&amp;</m:t>
+                    </m:r>
+                    <m:r>
+                      <m:rPr>
+                        <m:sty m:val="p"/>
+                      </m:rPr>
+                      <m:t>=</m:t>
+                    </m:r>
+                    <m:r>
+                      <m:t>​</m:t>
+                    </m:r>
+                    <m:d>
+                      <m:dPr>
+                        <m:begChr m:val="("/>
+                        <m:sepChr m:val=""/>
+                        <m:endChr m:val=")"/>
+                        <m:grow/>
+                      </m:dPr>
+                      <m:e>
+                        <m:f>
+                          <m:fPr>
+                            <m:type m:val="bar"/>
+                          </m:fPr>
+                          <m:num>
+                            <m:r>
+                              <m:rPr>
+                                <m:sty m:val="p"/>
+                              </m:rPr>
+                              <m:t>p</m:t>
+                            </m:r>
+                            <m:r>
+                              <m:rPr>
+                                <m:sty m:val="p"/>
+                              </m:rPr>
+                              <m:t>(</m:t>
+                            </m:r>
+                            <m:r>
+                              <m:t>B</m:t>
+                            </m:r>
+                            <m:r>
+                              <m:rPr>
+                                <m:sty m:val="p"/>
+                              </m:rPr>
+                              <m:t>,</m:t>
+                            </m:r>
+                            <m:r>
+                              <m:t>A</m:t>
+                            </m:r>
+                            <m:r>
+                              <m:rPr>
+                                <m:sty m:val="p"/>
+                              </m:rPr>
+                              <m:t>∣</m:t>
+                            </m:r>
+                            <m:r>
+                              <m:t>C</m:t>
+                            </m:r>
+                            <m:r>
+                              <m:rPr>
+                                <m:sty m:val="p"/>
+                              </m:rPr>
+                              <m:t>)</m:t>
+                            </m:r>
+                          </m:num>
+                          <m:den>
+                            <m:r>
+                              <m:rPr>
+                                <m:sty m:val="p"/>
+                              </m:rPr>
+                              <m:t>p</m:t>
+                            </m:r>
+                            <m:r>
+                              <m:rPr>
+                                <m:sty m:val="p"/>
+                              </m:rPr>
+                              <m:t>(</m:t>
+                            </m:r>
+                            <m:r>
+                              <m:rPr>
+                                <m:sty m:val="p"/>
+                              </m:rPr>
+                              <m:t>¬</m:t>
+                            </m:r>
+                            <m:r>
+                              <m:t>B</m:t>
+                            </m:r>
+                            <m:r>
+                              <m:rPr>
+                                <m:sty m:val="p"/>
+                              </m:rPr>
+                              <m:t>,</m:t>
+                            </m:r>
+                            <m:r>
+                              <m:t>A</m:t>
+                            </m:r>
+                            <m:r>
+                              <m:rPr>
+                                <m:sty m:val="p"/>
+                              </m:rPr>
+                              <m:t>∣</m:t>
+                            </m:r>
+                            <m:r>
+                              <m:t>C</m:t>
+                            </m:r>
+                            <m:r>
+                              <m:rPr>
+                                <m:sty m:val="p"/>
+                              </m:rPr>
+                              <m:t>)</m:t>
+                            </m:r>
+                          </m:den>
+                        </m:f>
+                      </m:e>
+                    </m:d>
+                    <m:r>
+                      <m:t>​</m:t>
+                    </m:r>
+                    <m:r>
+                      <m:t>​</m:t>
+                    </m:r>
+                    <m:d>
+                      <m:dPr>
+                        <m:begChr m:val="("/>
+                        <m:sepChr m:val=""/>
+                        <m:endChr m:val=")"/>
+                        <m:grow/>
+                      </m:dPr>
+                      <m:e>
+                        <m:f>
+                          <m:fPr>
+                            <m:type m:val="bar"/>
+                          </m:fPr>
+                          <m:num>
+                            <m:r>
+                              <m:rPr>
+                                <m:sty m:val="p"/>
+                              </m:rPr>
+                              <m:t>p</m:t>
+                            </m:r>
+                            <m:r>
+                              <m:rPr>
+                                <m:sty m:val="p"/>
+                              </m:rPr>
+                              <m:t>(</m:t>
+                            </m:r>
+                            <m:r>
+                              <m:rPr>
+                                <m:sty m:val="p"/>
+                              </m:rPr>
+                              <m:t>¬</m:t>
+                            </m:r>
+                            <m:r>
+                              <m:t>B</m:t>
+                            </m:r>
+                            <m:r>
+                              <m:rPr>
+                                <m:sty m:val="p"/>
+                              </m:rPr>
+                              <m:t>,</m:t>
+                            </m:r>
+                            <m:r>
+                              <m:rPr>
+                                <m:sty m:val="p"/>
+                              </m:rPr>
+                              <m:t>¬</m:t>
+                            </m:r>
+                            <m:r>
+                              <m:t>A</m:t>
+                            </m:r>
+                            <m:r>
+                              <m:rPr>
+                                <m:sty m:val="p"/>
+                              </m:rPr>
+                              <m:t>∣</m:t>
+                            </m:r>
+                            <m:r>
+                              <m:t>C</m:t>
+                            </m:r>
+                            <m:r>
+                              <m:rPr>
+                                <m:sty m:val="p"/>
+                              </m:rPr>
+                              <m:t>)</m:t>
+                            </m:r>
+                          </m:num>
+                          <m:den>
+                            <m:r>
+                              <m:rPr>
+                                <m:sty m:val="p"/>
+                              </m:rPr>
+                              <m:t>p</m:t>
+                            </m:r>
+                            <m:r>
+                              <m:rPr>
+                                <m:sty m:val="p"/>
+                              </m:rPr>
+                              <m:t>(</m:t>
+                            </m:r>
+                            <m:r>
+                              <m:t>B</m:t>
+                            </m:r>
+                            <m:r>
+                              <m:rPr>
+                                <m:sty m:val="p"/>
+                              </m:rPr>
+                              <m:t>,</m:t>
+                            </m:r>
+                            <m:r>
+                              <m:rPr>
+                                <m:sty m:val="p"/>
+                              </m:rPr>
+                              <m:t>¬</m:t>
+                            </m:r>
+                            <m:r>
+                              <m:t>A</m:t>
+                            </m:r>
+                            <m:r>
+                              <m:rPr>
+                                <m:sty m:val="p"/>
+                              </m:rPr>
+                              <m:t>∣</m:t>
+                            </m:r>
+                            <m:r>
+                              <m:t>C</m:t>
+                            </m:r>
+                            <m:r>
+                              <m:rPr>
+                                <m:sty m:val="p"/>
+                              </m:rPr>
+                              <m:t>)</m:t>
+                            </m:r>
+                          </m:den>
+                        </m:f>
+                      </m:e>
+                    </m:d>
+                    <m:r>
+                      <m:t>​</m:t>
+                    </m:r>
+                    <m:r>
+                      <m:t>&amp;</m:t>
+                    </m:r>
+                    <m:r>
+                      <m:t>&amp;</m:t>
+                    </m:r>
+                    <m:r>
+                      <m:rPr>
+                        <m:nor/>
+                        <m:sty m:val="p"/>
+                      </m:rPr>
+                      <m:t>(swap the two highlighted denominators)</m:t>
+                    </m:r>
+                  </m:e>
+                  <m:e>
+                    <m:r>
+                      <m:t>&amp;</m:t>
+                    </m:r>
+                    <m:r>
+                      <m:rPr>
+                        <m:sty m:val="p"/>
+                      </m:rPr>
+                      <m:t>=</m:t>
+                    </m:r>
+                    <m:r>
+                      <m:t>​</m:t>
+                    </m:r>
+                    <m:d>
+                      <m:dPr>
+                        <m:begChr m:val="("/>
+                        <m:sepChr m:val=""/>
+                        <m:endChr m:val=")"/>
+                        <m:grow/>
+                      </m:dPr>
+                      <m:e>
+                        <m:f>
+                          <m:fPr>
+                            <m:type m:val="bar"/>
+                          </m:fPr>
+                          <m:num>
+                            <m:r>
+                              <m:rPr>
+                                <m:sty m:val="p"/>
+                              </m:rPr>
+                              <m:t>p</m:t>
+                            </m:r>
+                            <m:r>
+                              <m:rPr>
+                                <m:sty m:val="p"/>
+                              </m:rPr>
+                              <m:t>(</m:t>
+                            </m:r>
+                            <m:r>
+                              <m:t>B</m:t>
+                            </m:r>
+                            <m:r>
+                              <m:rPr>
+                                <m:sty m:val="p"/>
+                              </m:rPr>
+                              <m:t>,</m:t>
+                            </m:r>
+                            <m:r>
+                              <m:t>A</m:t>
+                            </m:r>
+                            <m:r>
+                              <m:rPr>
+                                <m:sty m:val="p"/>
+                              </m:rPr>
+                              <m:t>∣</m:t>
+                            </m:r>
+                            <m:r>
+                              <m:t>C</m:t>
+                            </m:r>
+                            <m:r>
+                              <m:rPr>
+                                <m:sty m:val="p"/>
+                              </m:rPr>
+                              <m:t>)</m:t>
+                            </m:r>
+                            <m:r>
+                              <m:rPr>
+                                <m:sty m:val="p"/>
+                              </m:rPr>
+                              <m:t>/</m:t>
+                            </m:r>
+                            <m:r>
+                              <m:rPr>
+                                <m:sty m:val="p"/>
+                              </m:rPr>
+                              <m:t>p</m:t>
+                            </m:r>
+                            <m:r>
+                              <m:rPr>
+                                <m:sty m:val="p"/>
+                              </m:rPr>
+                              <m:t>(</m:t>
+                            </m:r>
+                            <m:r>
+                              <m:t>A</m:t>
+                            </m:r>
+                            <m:r>
+                              <m:rPr>
+                                <m:sty m:val="p"/>
+                              </m:rPr>
+                              <m:t>∣</m:t>
+                            </m:r>
+                            <m:r>
+                              <m:t>C</m:t>
+                            </m:r>
+                            <m:r>
+                              <m:rPr>
+                                <m:sty m:val="p"/>
+                              </m:rPr>
+                              <m:t>)</m:t>
+                            </m:r>
+                          </m:num>
+                          <m:den>
+                            <m:r>
+                              <m:rPr>
+                                <m:sty m:val="p"/>
+                              </m:rPr>
+                              <m:t>p</m:t>
+                            </m:r>
+                            <m:r>
+                              <m:rPr>
+                                <m:sty m:val="p"/>
+                              </m:rPr>
+                              <m:t>(</m:t>
+                            </m:r>
+                            <m:r>
+                              <m:rPr>
+                                <m:sty m:val="p"/>
+                              </m:rPr>
+                              <m:t>¬</m:t>
+                            </m:r>
+                            <m:r>
+                              <m:t>B</m:t>
+                            </m:r>
+                            <m:r>
+                              <m:rPr>
+                                <m:sty m:val="p"/>
+                              </m:rPr>
+                              <m:t>,</m:t>
+                            </m:r>
+                            <m:r>
+                              <m:t>A</m:t>
+                            </m:r>
+                            <m:r>
+                              <m:rPr>
+                                <m:sty m:val="p"/>
+                              </m:rPr>
+                              <m:t>∣</m:t>
+                            </m:r>
+                            <m:r>
+                              <m:t>C</m:t>
+                            </m:r>
+                            <m:r>
+                              <m:rPr>
+                                <m:sty m:val="p"/>
+                              </m:rPr>
+                              <m:t>)</m:t>
+                            </m:r>
+                            <m:r>
+                              <m:rPr>
+                                <m:sty m:val="p"/>
+                              </m:rPr>
+                              <m:t>/</m:t>
+                            </m:r>
+                            <m:r>
+                              <m:rPr>
+                                <m:sty m:val="p"/>
+                              </m:rPr>
+                              <m:t>p</m:t>
+                            </m:r>
+                            <m:r>
+                              <m:rPr>
+                                <m:sty m:val="p"/>
+                              </m:rPr>
+                              <m:t>(</m:t>
+                            </m:r>
+                            <m:r>
+                              <m:t>A</m:t>
+                            </m:r>
+                            <m:r>
+                              <m:rPr>
+                                <m:sty m:val="p"/>
+                              </m:rPr>
+                              <m:t>∣</m:t>
+                            </m:r>
+                            <m:r>
+                              <m:t>C</m:t>
+                            </m:r>
+                            <m:r>
+                              <m:rPr>
+                                <m:sty m:val="p"/>
+                              </m:rPr>
+                              <m:t>)</m:t>
+                            </m:r>
+                          </m:den>
+                        </m:f>
+                      </m:e>
+                    </m:d>
+                    <m:r>
+                      <m:t>​</m:t>
+                    </m:r>
+                    <m:r>
+                      <m:t>​</m:t>
+                    </m:r>
+                    <m:d>
+                      <m:dPr>
+                        <m:begChr m:val="("/>
+                        <m:sepChr m:val=""/>
+                        <m:endChr m:val=")"/>
+                        <m:grow/>
+                      </m:dPr>
+                      <m:e>
+                        <m:f>
+                          <m:fPr>
+                            <m:type m:val="bar"/>
+                          </m:fPr>
+                          <m:num>
+                            <m:r>
+                              <m:rPr>
+                                <m:sty m:val="p"/>
+                              </m:rPr>
+                              <m:t>p</m:t>
+                            </m:r>
+                            <m:r>
+                              <m:rPr>
+                                <m:sty m:val="p"/>
+                              </m:rPr>
+                              <m:t>(</m:t>
+                            </m:r>
+                            <m:r>
+                              <m:rPr>
+                                <m:sty m:val="p"/>
+                              </m:rPr>
+                              <m:t>¬</m:t>
+                            </m:r>
+                            <m:r>
+                              <m:t>B</m:t>
+                            </m:r>
+                            <m:r>
+                              <m:rPr>
+                                <m:sty m:val="p"/>
+                              </m:rPr>
+                              <m:t>,</m:t>
+                            </m:r>
+                            <m:r>
+                              <m:rPr>
+                                <m:sty m:val="p"/>
+                              </m:rPr>
+                              <m:t>¬</m:t>
+                            </m:r>
+                            <m:r>
+                              <m:t>A</m:t>
+                            </m:r>
+                            <m:r>
+                              <m:rPr>
+                                <m:sty m:val="p"/>
+                              </m:rPr>
+                              <m:t>∣</m:t>
+                            </m:r>
+                            <m:r>
+                              <m:t>C</m:t>
+                            </m:r>
+                            <m:r>
+                              <m:rPr>
+                                <m:sty m:val="p"/>
+                              </m:rPr>
+                              <m:t>)</m:t>
+                            </m:r>
+                            <m:r>
+                              <m:rPr>
+                                <m:sty m:val="p"/>
+                              </m:rPr>
+                              <m:t>/</m:t>
+                            </m:r>
+                            <m:r>
+                              <m:rPr>
+                                <m:sty m:val="p"/>
+                              </m:rPr>
+                              <m:t>p</m:t>
+                            </m:r>
+                            <m:r>
+                              <m:rPr>
+                                <m:sty m:val="p"/>
+                              </m:rPr>
+                              <m:t>(</m:t>
+                            </m:r>
+                            <m:r>
+                              <m:rPr>
+                                <m:sty m:val="p"/>
+                              </m:rPr>
+                              <m:t>¬</m:t>
+                            </m:r>
+                            <m:r>
+                              <m:t>A</m:t>
+                            </m:r>
+                            <m:r>
+                              <m:rPr>
+                                <m:sty m:val="p"/>
+                              </m:rPr>
+                              <m:t>∣</m:t>
+                            </m:r>
+                            <m:r>
+                              <m:t>C</m:t>
+                            </m:r>
+                            <m:r>
+                              <m:rPr>
+                                <m:sty m:val="p"/>
+                              </m:rPr>
+                              <m:t>)</m:t>
+                            </m:r>
+                          </m:num>
+                          <m:den>
+                            <m:r>
+                              <m:rPr>
+                                <m:sty m:val="p"/>
+                              </m:rPr>
+                              <m:t>p</m:t>
+                            </m:r>
+                            <m:r>
+                              <m:rPr>
+                                <m:sty m:val="p"/>
+                              </m:rPr>
+                              <m:t>(</m:t>
+                            </m:r>
+                            <m:r>
+                              <m:t>B</m:t>
+                            </m:r>
+                            <m:r>
+                              <m:rPr>
+                                <m:sty m:val="p"/>
+                              </m:rPr>
+                              <m:t>,</m:t>
+                            </m:r>
+                            <m:r>
+                              <m:rPr>
+                                <m:sty m:val="p"/>
+                              </m:rPr>
+                              <m:t>¬</m:t>
+                            </m:r>
+                            <m:r>
+                              <m:t>A</m:t>
+                            </m:r>
+                            <m:r>
+                              <m:rPr>
+                                <m:sty m:val="p"/>
+                              </m:rPr>
+                              <m:t>∣</m:t>
+                            </m:r>
+                            <m:r>
+                              <m:t>C</m:t>
+                            </m:r>
+                            <m:r>
+                              <m:rPr>
+                                <m:sty m:val="p"/>
+                              </m:rPr>
+                              <m:t>)</m:t>
+                            </m:r>
+                            <m:r>
+                              <m:rPr>
+                                <m:sty m:val="p"/>
+                              </m:rPr>
+                              <m:t>/</m:t>
+                            </m:r>
+                            <m:r>
+                              <m:rPr>
+                                <m:sty m:val="p"/>
+                              </m:rPr>
+                              <m:t>p</m:t>
+                            </m:r>
+                            <m:r>
+                              <m:rPr>
+                                <m:sty m:val="p"/>
+                              </m:rPr>
+                              <m:t>(</m:t>
+                            </m:r>
+                            <m:r>
+                              <m:rPr>
+                                <m:sty m:val="p"/>
+                              </m:rPr>
+                              <m:t>¬</m:t>
+                            </m:r>
+                            <m:r>
+                              <m:t>A</m:t>
+                            </m:r>
+                            <m:r>
+                              <m:rPr>
+                                <m:sty m:val="p"/>
+                              </m:rPr>
+                              <m:t>∣</m:t>
+                            </m:r>
+                            <m:r>
+                              <m:t>C</m:t>
+                            </m:r>
+                            <m:r>
+                              <m:rPr>
+                                <m:sty m:val="p"/>
+                              </m:rPr>
+                              <m:t>)</m:t>
+                            </m:r>
+                          </m:den>
+                        </m:f>
+                      </m:e>
+                    </m:d>
+                    <m:r>
+                      <m:t>​</m:t>
+                    </m:r>
+                    <m:r>
+                      <m:t>&amp;</m:t>
+                    </m:r>
+                    <m:r>
+                      <m:t>&amp;</m:t>
+                    </m:r>
+                    <m:r>
+                      <m:rPr>
+                        <m:nor/>
+                        <m:sty m:val="p"/>
+                      </m:rPr>
+                      <m:t>(divide the top and bottom of each factor by the same quantity)</m:t>
+                    </m:r>
+                  </m:e>
+                  <m:e>
+                    <m:r>
+                      <m:t>&amp;</m:t>
+                    </m:r>
+                    <m:r>
+                      <m:rPr>
+                        <m:sty m:val="p"/>
+                      </m:rPr>
+                      <m:t>=</m:t>
+                    </m:r>
+                    <m:r>
+                      <m:t>​</m:t>
+                    </m:r>
+                    <m:d>
+                      <m:dPr>
+                        <m:begChr m:val="("/>
+                        <m:sepChr m:val=""/>
+                        <m:endChr m:val=")"/>
+                        <m:grow/>
+                      </m:dPr>
+                      <m:e>
+                        <m:f>
+                          <m:fPr>
+                            <m:type m:val="bar"/>
+                          </m:fPr>
+                          <m:num>
+                            <m:r>
+                              <m:rPr>
+                                <m:sty m:val="p"/>
+                              </m:rPr>
+                              <m:t>p</m:t>
+                            </m:r>
+                            <m:r>
+                              <m:rPr>
+                                <m:sty m:val="p"/>
+                              </m:rPr>
+                              <m:t>(</m:t>
+                            </m:r>
+                            <m:r>
+                              <m:t>B</m:t>
+                            </m:r>
+                            <m:r>
+                              <m:rPr>
+                                <m:sty m:val="p"/>
+                              </m:rPr>
+                              <m:t>|</m:t>
+                            </m:r>
+                            <m:r>
+                              <m:t>A</m:t>
+                            </m:r>
+                            <m:r>
+                              <m:rPr>
+                                <m:sty m:val="p"/>
+                              </m:rPr>
+                              <m:t>,</m:t>
+                            </m:r>
+                            <m:r>
+                              <m:t>C</m:t>
+                            </m:r>
+                            <m:r>
+                              <m:rPr>
+                                <m:sty m:val="p"/>
+                              </m:rPr>
+                              <m:t>)</m:t>
+                            </m:r>
+                          </m:num>
+                          <m:den>
+                            <m:r>
+                              <m:rPr>
+                                <m:sty m:val="p"/>
+                              </m:rPr>
+                              <m:t>p</m:t>
+                            </m:r>
+                            <m:r>
+                              <m:rPr>
+                                <m:sty m:val="p"/>
+                              </m:rPr>
+                              <m:t>(</m:t>
+                            </m:r>
+                            <m:r>
+                              <m:rPr>
+                                <m:sty m:val="p"/>
+                              </m:rPr>
+                              <m:t>¬</m:t>
+                            </m:r>
+                            <m:r>
+                              <m:t>B</m:t>
+                            </m:r>
+                            <m:r>
+                              <m:rPr>
+                                <m:sty m:val="p"/>
+                              </m:rPr>
+                              <m:t>|</m:t>
+                            </m:r>
+                            <m:r>
+                              <m:t>A</m:t>
+                            </m:r>
+                            <m:r>
+                              <m:rPr>
+                                <m:sty m:val="p"/>
+                              </m:rPr>
+                              <m:t>,</m:t>
+                            </m:r>
+                            <m:r>
+                              <m:t>C</m:t>
+                            </m:r>
+                            <m:r>
+                              <m:rPr>
+                                <m:sty m:val="p"/>
+                              </m:rPr>
+                              <m:t>)</m:t>
+                            </m:r>
+                          </m:den>
+                        </m:f>
+                      </m:e>
+                    </m:d>
+                    <m:r>
+                      <m:t>​</m:t>
+                    </m:r>
+                    <m:r>
+                      <m:t>​</m:t>
+                    </m:r>
+                    <m:d>
+                      <m:dPr>
+                        <m:begChr m:val="("/>
+                        <m:sepChr m:val=""/>
+                        <m:endChr m:val=")"/>
+                        <m:grow/>
+                      </m:dPr>
+                      <m:e>
+                        <m:f>
+                          <m:fPr>
+                            <m:type m:val="bar"/>
+                          </m:fPr>
+                          <m:num>
+                            <m:r>
+                              <m:rPr>
+                                <m:sty m:val="p"/>
+                              </m:rPr>
+                              <m:t>p</m:t>
+                            </m:r>
+                            <m:r>
+                              <m:rPr>
+                                <m:sty m:val="p"/>
+                              </m:rPr>
+                              <m:t>(</m:t>
+                            </m:r>
+                            <m:r>
+                              <m:rPr>
+                                <m:sty m:val="p"/>
+                              </m:rPr>
+                              <m:t>¬</m:t>
+                            </m:r>
+                            <m:r>
+                              <m:t>B</m:t>
+                            </m:r>
+                            <m:r>
+                              <m:rPr>
+                                <m:sty m:val="p"/>
+                              </m:rPr>
+                              <m:t>|</m:t>
+                            </m:r>
+                            <m:r>
+                              <m:rPr>
+                                <m:sty m:val="p"/>
+                              </m:rPr>
+                              <m:t>¬</m:t>
+                            </m:r>
+                            <m:r>
+                              <m:t>A</m:t>
+                            </m:r>
+                            <m:r>
+                              <m:rPr>
+                                <m:sty m:val="p"/>
+                              </m:rPr>
+                              <m:t>,</m:t>
+                            </m:r>
+                            <m:r>
+                              <m:t>C</m:t>
+                            </m:r>
+                            <m:r>
+                              <m:rPr>
+                                <m:sty m:val="p"/>
+                              </m:rPr>
+                              <m:t>)</m:t>
+                            </m:r>
+                          </m:num>
+                          <m:den>
+                            <m:r>
+                              <m:rPr>
+                                <m:sty m:val="p"/>
+                              </m:rPr>
+                              <m:t>p</m:t>
+                            </m:r>
+                            <m:r>
+                              <m:rPr>
+                                <m:sty m:val="p"/>
+                              </m:rPr>
+                              <m:t>(</m:t>
+                            </m:r>
+                            <m:r>
+                              <m:t>B</m:t>
+                            </m:r>
+                            <m:r>
+                              <m:rPr>
+                                <m:sty m:val="p"/>
+                              </m:rPr>
+                              <m:t>|</m:t>
+                            </m:r>
+                            <m:r>
+                              <m:rPr>
+                                <m:sty m:val="p"/>
+                              </m:rPr>
+                              <m:t>¬</m:t>
+                            </m:r>
+                            <m:r>
+                              <m:t>A</m:t>
+                            </m:r>
+                            <m:r>
+                              <m:rPr>
+                                <m:sty m:val="p"/>
+                              </m:rPr>
+                              <m:t>,</m:t>
+                            </m:r>
+                            <m:r>
+                              <m:t>C</m:t>
+                            </m:r>
+                            <m:r>
+                              <m:rPr>
+                                <m:sty m:val="p"/>
+                              </m:rPr>
+                              <m:t>)</m:t>
+                            </m:r>
+                          </m:den>
+                        </m:f>
+                      </m:e>
+                    </m:d>
+                    <m:r>
+                      <m:t>​</m:t>
+                    </m:r>
+                    <m:r>
+                      <m:t>&amp;</m:t>
+                    </m:r>
+                    <m:r>
+                      <m:t>&amp;</m:t>
+                    </m:r>
+                    <m:r>
+                      <m:rPr>
+                        <m:nor/>
+                        <m:sty m:val="p"/>
+                      </m:rPr>
+                      <m:t>(definition of conditional probability, in each of the four terms)</m:t>
+                    </m:r>
+                  </m:e>
+                  <m:e>
+                    <m:r>
+                      <m:t>&amp;</m:t>
+                    </m:r>
+                    <m:r>
+                      <m:rPr>
+                        <m:sty m:val="p"/>
+                      </m:rPr>
+                      <m:t>=</m:t>
+                    </m:r>
+                    <m:r>
+                      <m:t>​</m:t>
+                    </m:r>
+                    <m:d>
+                      <m:dPr>
+                        <m:begChr m:val="("/>
+                        <m:sepChr m:val=""/>
+                        <m:endChr m:val=")"/>
+                        <m:grow/>
+                      </m:dPr>
+                      <m:e>
+                        <m:f>
+                          <m:fPr>
+                            <m:type m:val="bar"/>
+                          </m:fPr>
+                          <m:num>
+                            <m:r>
+                              <m:rPr>
+                                <m:sty m:val="p"/>
+                              </m:rPr>
+                              <m:t>p</m:t>
+                            </m:r>
+                            <m:r>
+                              <m:rPr>
+                                <m:sty m:val="p"/>
+                              </m:rPr>
+                              <m:t>(</m:t>
+                            </m:r>
+                            <m:r>
+                              <m:t>B</m:t>
+                            </m:r>
+                            <m:r>
+                              <m:rPr>
+                                <m:sty m:val="p"/>
+                              </m:rPr>
+                              <m:t>|</m:t>
+                            </m:r>
+                            <m:r>
+                              <m:t>A</m:t>
+                            </m:r>
+                            <m:r>
+                              <m:rPr>
+                                <m:sty m:val="p"/>
+                              </m:rPr>
+                              <m:t>,</m:t>
+                            </m:r>
+                            <m:r>
+                              <m:t>C</m:t>
+                            </m:r>
+                            <m:r>
+                              <m:rPr>
+                                <m:sty m:val="p"/>
+                              </m:rPr>
+                              <m:t>)</m:t>
+                            </m:r>
+                          </m:num>
+                          <m:den>
+                            <m:r>
+                              <m:rPr>
+                                <m:sty m:val="p"/>
+                              </m:rPr>
+                              <m:t>p</m:t>
+                            </m:r>
+                            <m:r>
+                              <m:rPr>
+                                <m:sty m:val="p"/>
+                              </m:rPr>
+                              <m:t>(</m:t>
+                            </m:r>
+                            <m:r>
+                              <m:rPr>
+                                <m:sty m:val="p"/>
+                              </m:rPr>
+                              <m:t>¬</m:t>
+                            </m:r>
+                            <m:r>
+                              <m:t>B</m:t>
+                            </m:r>
+                            <m:r>
+                              <m:rPr>
+                                <m:sty m:val="p"/>
+                              </m:rPr>
+                              <m:t>|</m:t>
+                            </m:r>
+                            <m:r>
+                              <m:t>A</m:t>
+                            </m:r>
+                            <m:r>
+                              <m:rPr>
+                                <m:sty m:val="p"/>
+                              </m:rPr>
+                              <m:t>,</m:t>
+                            </m:r>
+                            <m:r>
+                              <m:t>C</m:t>
+                            </m:r>
+                            <m:r>
+                              <m:rPr>
+                                <m:sty m:val="p"/>
+                              </m:rPr>
+                              <m:t>)</m:t>
+                            </m:r>
+                          </m:den>
+                        </m:f>
+                      </m:e>
+                    </m:d>
+                    <m:r>
+                      <m:t>​</m:t>
+                    </m:r>
+                    <m:sSup>
+                      <m:e>
+                        <m:r>
+                          <m:t>​</m:t>
+                        </m:r>
+                        <m:d>
+                          <m:dPr>
+                            <m:begChr m:val="("/>
+                            <m:sepChr m:val=""/>
+                            <m:endChr m:val=")"/>
+                            <m:grow/>
+                          </m:dPr>
+                          <m:e>
+                            <m:f>
+                              <m:fPr>
+                                <m:type m:val="bar"/>
+                              </m:fPr>
+                              <m:num>
+                                <m:r>
+                                  <m:rPr>
+                                    <m:sty m:val="p"/>
+                                  </m:rPr>
+                                  <m:t>p</m:t>
+                                </m:r>
+                                <m:r>
+                                  <m:rPr>
+                                    <m:sty m:val="p"/>
+                                  </m:rPr>
+                                  <m:t>(</m:t>
+                                </m:r>
+                                <m:r>
+                                  <m:t>B</m:t>
+                                </m:r>
+                                <m:r>
+                                  <m:rPr>
+                                    <m:sty m:val="p"/>
+                                  </m:rPr>
+                                  <m:t>|</m:t>
+                                </m:r>
+                                <m:r>
+                                  <m:rPr>
+                                    <m:sty m:val="p"/>
+                                  </m:rPr>
+                                  <m:t>¬</m:t>
+                                </m:r>
+                                <m:r>
+                                  <m:t>A</m:t>
+                                </m:r>
+                                <m:r>
+                                  <m:rPr>
+                                    <m:sty m:val="p"/>
+                                  </m:rPr>
+                                  <m:t>,</m:t>
+                                </m:r>
+                                <m:r>
+                                  <m:t>C</m:t>
+                                </m:r>
+                                <m:r>
+                                  <m:rPr>
+                                    <m:sty m:val="p"/>
+                                  </m:rPr>
+                                  <m:t>)</m:t>
+                                </m:r>
+                              </m:num>
+                              <m:den>
+                                <m:r>
+                                  <m:rPr>
+                                    <m:sty m:val="p"/>
+                                  </m:rPr>
+                                  <m:t>p</m:t>
+                                </m:r>
+                                <m:r>
+                                  <m:rPr>
+                                    <m:sty m:val="p"/>
+                                  </m:rPr>
+                                  <m:t>(</m:t>
+                                </m:r>
+                                <m:r>
+                                  <m:rPr>
+                                    <m:sty m:val="p"/>
+                                  </m:rPr>
+                                  <m:t>¬</m:t>
+                                </m:r>
+                                <m:r>
+                                  <m:t>B</m:t>
+                                </m:r>
+                                <m:r>
+                                  <m:rPr>
+                                    <m:sty m:val="p"/>
+                                  </m:rPr>
+                                  <m:t>|</m:t>
+                                </m:r>
+                                <m:r>
+                                  <m:rPr>
+                                    <m:sty m:val="p"/>
+                                  </m:rPr>
+                                  <m:t>¬</m:t>
+                                </m:r>
+                                <m:r>
+                                  <m:t>A</m:t>
+                                </m:r>
+                                <m:r>
+                                  <m:rPr>
+                                    <m:sty m:val="p"/>
+                                  </m:rPr>
+                                  <m:t>,</m:t>
+                                </m:r>
+                                <m:r>
+                                  <m:t>C</m:t>
+                                </m:r>
+                                <m:r>
+                                  <m:rPr>
+                                    <m:sty m:val="p"/>
+                                  </m:rPr>
+                                  <m:t>)</m:t>
+                                </m:r>
+                              </m:den>
+                            </m:f>
+                          </m:e>
+                        </m:d>
+                        <m:r>
+                          <m:t>​</m:t>
+                        </m:r>
+                      </m:e>
+                      <m:sup>
+                        <m:r>
+                          <m:rPr>
+                            <m:sty m:val="p"/>
+                          </m:rPr>
+                          <m:t>−</m:t>
+                        </m:r>
+                        <m:r>
+                          <m:t>1</m:t>
+                        </m:r>
+                      </m:sup>
+                    </m:sSup>
+                    <m:r>
+                      <m:t>&amp;</m:t>
+                    </m:r>
+                    <m:r>
+                      <m:t>&amp;</m:t>
+                    </m:r>
+                    <m:r>
+                      <m:rPr>
+                        <m:nor/>
+                        <m:sty m:val="p"/>
+                      </m:rPr>
+                      <m:t>(a flipped fraction is the reciprocal of the original)</m:t>
+                    </m:r>
+                  </m:e>
+                  <m:e>
+                    <m:r>
+                      <m:t>&amp;</m:t>
+                    </m:r>
+                    <m:r>
+                      <m:rPr>
+                        <m:sty m:val="p"/>
+                      </m:rPr>
+                      <m:t>=</m:t>
+                    </m:r>
+                    <m:f>
+                      <m:fPr>
+                        <m:type m:val="bar"/>
+                      </m:fPr>
+                      <m:num>
+                        <m:r>
+                          <m:t>​</m:t>
+                        </m:r>
+                        <m:d>
+                          <m:dPr>
+                            <m:begChr m:val="("/>
+                            <m:sepChr m:val=""/>
+                            <m:endChr m:val=")"/>
+                            <m:grow/>
+                          </m:dPr>
+                          <m:e>
+                            <m:f>
+                              <m:fPr>
+                                <m:type m:val="bar"/>
+                              </m:fPr>
+                              <m:num>
+                                <m:r>
+                                  <m:rPr>
+                                    <m:sty m:val="p"/>
+                                  </m:rPr>
+                                  <m:t>p</m:t>
+                                </m:r>
+                                <m:r>
+                                  <m:rPr>
+                                    <m:sty m:val="p"/>
+                                  </m:rPr>
+                                  <m:t>(</m:t>
+                                </m:r>
+                                <m:r>
+                                  <m:t>B</m:t>
+                                </m:r>
+                                <m:r>
+                                  <m:rPr>
+                                    <m:sty m:val="p"/>
+                                  </m:rPr>
+                                  <m:t>|</m:t>
+                                </m:r>
+                                <m:r>
+                                  <m:t>A</m:t>
+                                </m:r>
+                                <m:r>
+                                  <m:rPr>
+                                    <m:sty m:val="p"/>
+                                  </m:rPr>
+                                  <m:t>,</m:t>
+                                </m:r>
+                                <m:r>
+                                  <m:t>C</m:t>
+                                </m:r>
+                                <m:r>
+                                  <m:rPr>
+                                    <m:sty m:val="p"/>
+                                  </m:rPr>
+                                  <m:t>)</m:t>
+                                </m:r>
+                              </m:num>
+                              <m:den>
+                                <m:r>
+                                  <m:rPr>
+                                    <m:sty m:val="p"/>
+                                  </m:rPr>
+                                  <m:t>p</m:t>
+                                </m:r>
+                                <m:r>
+                                  <m:rPr>
+                                    <m:sty m:val="p"/>
+                                  </m:rPr>
+                                  <m:t>(</m:t>
+                                </m:r>
+                                <m:r>
+                                  <m:rPr>
+                                    <m:sty m:val="p"/>
+                                  </m:rPr>
+                                  <m:t>¬</m:t>
+                                </m:r>
+                                <m:r>
+                                  <m:t>B</m:t>
+                                </m:r>
+                                <m:r>
+                                  <m:rPr>
+                                    <m:sty m:val="p"/>
+                                  </m:rPr>
+                                  <m:t>|</m:t>
+                                </m:r>
+                                <m:r>
+                                  <m:t>A</m:t>
+                                </m:r>
+                                <m:r>
+                                  <m:rPr>
+                                    <m:sty m:val="p"/>
+                                  </m:rPr>
+                                  <m:t>,</m:t>
+                                </m:r>
+                                <m:r>
+                                  <m:t>C</m:t>
+                                </m:r>
+                                <m:r>
+                                  <m:rPr>
+                                    <m:sty m:val="p"/>
+                                  </m:rPr>
+                                  <m:t>)</m:t>
+                                </m:r>
+                              </m:den>
+                            </m:f>
+                          </m:e>
+                        </m:d>
+                        <m:r>
+                          <m:t>​</m:t>
+                        </m:r>
+                      </m:num>
+                      <m:den>
+                        <m:r>
+                          <m:t>​</m:t>
+                        </m:r>
+                        <m:d>
+                          <m:dPr>
+                            <m:begChr m:val="("/>
+                            <m:sepChr m:val=""/>
+                            <m:endChr m:val=")"/>
+                            <m:grow/>
+                          </m:dPr>
+                          <m:e>
+                            <m:f>
+                              <m:fPr>
+                                <m:type m:val="bar"/>
+                              </m:fPr>
+                              <m:num>
+                                <m:r>
+                                  <m:rPr>
+                                    <m:sty m:val="p"/>
+                                  </m:rPr>
+                                  <m:t>p</m:t>
+                                </m:r>
+                                <m:r>
+                                  <m:rPr>
+                                    <m:sty m:val="p"/>
+                                  </m:rPr>
+                                  <m:t>(</m:t>
+                                </m:r>
+                                <m:r>
+                                  <m:t>B</m:t>
+                                </m:r>
+                                <m:r>
+                                  <m:rPr>
+                                    <m:sty m:val="p"/>
+                                  </m:rPr>
+                                  <m:t>|</m:t>
+                                </m:r>
+                                <m:r>
+                                  <m:rPr>
+                                    <m:sty m:val="p"/>
+                                  </m:rPr>
+                                  <m:t>¬</m:t>
+                                </m:r>
+                                <m:r>
+                                  <m:t>A</m:t>
+                                </m:r>
+                                <m:r>
+                                  <m:rPr>
+                                    <m:sty m:val="p"/>
+                                  </m:rPr>
+                                  <m:t>,</m:t>
+                                </m:r>
+                                <m:r>
+                                  <m:t>C</m:t>
+                                </m:r>
+                                <m:r>
+                                  <m:rPr>
+                                    <m:sty m:val="p"/>
+                                  </m:rPr>
+                                  <m:t>)</m:t>
+                                </m:r>
+                              </m:num>
+                              <m:den>
+                                <m:r>
+                                  <m:rPr>
+                                    <m:sty m:val="p"/>
+                                  </m:rPr>
+                                  <m:t>p</m:t>
+                                </m:r>
+                                <m:r>
+                                  <m:rPr>
+                                    <m:sty m:val="p"/>
+                                  </m:rPr>
+                                  <m:t>(</m:t>
+                                </m:r>
+                                <m:r>
+                                  <m:rPr>
+                                    <m:sty m:val="p"/>
+                                  </m:rPr>
+                                  <m:t>¬</m:t>
+                                </m:r>
+                                <m:r>
+                                  <m:t>B</m:t>
+                                </m:r>
+                                <m:r>
+                                  <m:rPr>
+                                    <m:sty m:val="p"/>
+                                  </m:rPr>
+                                  <m:t>|</m:t>
+                                </m:r>
+                                <m:r>
+                                  <m:rPr>
+                                    <m:sty m:val="p"/>
+                                  </m:rPr>
+                                  <m:t>¬</m:t>
+                                </m:r>
+                                <m:r>
+                                  <m:t>A</m:t>
+                                </m:r>
+                                <m:r>
+                                  <m:rPr>
+                                    <m:sty m:val="p"/>
+                                  </m:rPr>
+                                  <m:t>,</m:t>
+                                </m:r>
+                                <m:r>
+                                  <m:t>C</m:t>
+                                </m:r>
+                                <m:r>
+                                  <m:rPr>
+                                    <m:sty m:val="p"/>
+                                  </m:rPr>
+                                  <m:t>)</m:t>
+                                </m:r>
+                              </m:den>
+                            </m:f>
+                          </m:e>
+                        </m:d>
+                        <m:r>
+                          <m:t>​</m:t>
+                        </m:r>
+                      </m:den>
+                    </m:f>
+                    <m:r>
+                      <m:t>&amp;</m:t>
+                    </m:r>
+                    <m:r>
+                      <m:t>&amp;</m:t>
+                    </m:r>
+                    <m:r>
+                      <m:rPr>
+                        <m:nor/>
+                        <m:sty m:val="p"/>
+                      </m:rPr>
+                      <m:t>(multiplication by the reciprocal is division)</m:t>
+                    </m:r>
+                  </m:e>
+                  <m:e>
+                    <m:r>
+                      <m:t>&amp;</m:t>
+                    </m:r>
+                    <m:r>
+                      <m:rPr>
+                        <m:sty m:val="p"/>
+                      </m:rPr>
+                      <m:t>=</m:t>
+                    </m:r>
+                    <m:f>
+                      <m:fPr>
+                        <m:type m:val="bar"/>
+                      </m:fPr>
+                      <m:num>
+                        <m:r>
+                          <m:t>ω</m:t>
+                        </m:r>
+                        <m:r>
+                          <m:rPr>
+                            <m:sty m:val="p"/>
+                          </m:rPr>
+                          <m:t>(</m:t>
+                        </m:r>
+                        <m:r>
+                          <m:t>B</m:t>
+                        </m:r>
+                        <m:r>
+                          <m:rPr>
+                            <m:sty m:val="p"/>
+                          </m:rPr>
+                          <m:t>|</m:t>
+                        </m:r>
+                        <m:r>
+                          <m:t>A</m:t>
+                        </m:r>
+                        <m:r>
+                          <m:rPr>
+                            <m:sty m:val="p"/>
+                          </m:rPr>
+                          <m:t>,</m:t>
+                        </m:r>
+                        <m:r>
+                          <m:t>C</m:t>
+                        </m:r>
+                        <m:r>
+                          <m:rPr>
+                            <m:sty m:val="p"/>
+                          </m:rPr>
+                          <m:t>)</m:t>
+                        </m:r>
+                      </m:num>
+                      <m:den>
+                        <m:r>
+                          <m:t>ω</m:t>
+                        </m:r>
+                        <m:r>
+                          <m:rPr>
+                            <m:sty m:val="p"/>
+                          </m:rPr>
+                          <m:t>(</m:t>
+                        </m:r>
+                        <m:r>
+                          <m:t>B</m:t>
+                        </m:r>
+                        <m:r>
+                          <m:rPr>
+                            <m:sty m:val="p"/>
+                          </m:rPr>
+                          <m:t>|</m:t>
+                        </m:r>
+                        <m:r>
+                          <m:rPr>
+                            <m:sty m:val="p"/>
+                          </m:rPr>
+                          <m:t>¬</m:t>
+                        </m:r>
+                        <m:r>
+                          <m:t>A</m:t>
+                        </m:r>
+                        <m:r>
+                          <m:rPr>
+                            <m:sty m:val="p"/>
+                          </m:rPr>
+                          <m:t>,</m:t>
+                        </m:r>
+                        <m:r>
+                          <m:t>C</m:t>
+                        </m:r>
+                        <m:r>
+                          <m:rPr>
+                            <m:sty m:val="p"/>
+                          </m:rPr>
+                          <m:t>)</m:t>
+                        </m:r>
+                      </m:den>
+                    </m:f>
+                    <m:r>
+                      <m:t>&amp;</m:t>
+                    </m:r>
+                    <m:r>
+                      <m:t>&amp;</m:t>
+                    </m:r>
+                    <m:r>
+                      <m:rPr>
+                        <m:nor/>
+                        <m:sty m:val="p"/>
+                      </m:rPr>
+                      <m:t>(definition of conditional odds)</m:t>
+                    </m:r>
+                  </m:e>
+                  <m:e>
+                    <m:r>
+                      <m:t>&amp;</m:t>
+                    </m:r>
+                    <m:limUpp>
+                      <m:e>
+                        <m:r>
+                          <m:rPr>
+                            <m:sty m:val="p"/>
+                          </m:rPr>
+                          <m:t>=</m:t>
+                        </m:r>
+                      </m:e>
+                      <m:lim>
+                        <m:r>
+                          <m:rPr>
+                            <m:nor/>
+                            <m:sty m:val="p"/>
+                          </m:rPr>
+                          <m:t>def</m:t>
+                        </m:r>
+                      </m:lim>
+                    </m:limUpp>
+                    <m:sSub>
+                      <m:e>
+                        <m:r>
+                          <m:rPr>
+                            <m:nor/>
+                            <m:sty m:val="p"/>
+                          </m:rPr>
+                          <m:t>ϙ</m:t>
+                        </m:r>
+                      </m:e>
+                      <m:sub>
+                        <m:r>
+                          <m:t>ω</m:t>
+                        </m:r>
+                      </m:sub>
+                    </m:sSub>
+                    <m:r>
+                      <m:rPr>
+                        <m:sty m:val="p"/>
+                      </m:rPr>
+                      <m:t>(</m:t>
+                    </m:r>
+                    <m:r>
+                      <m:t>B</m:t>
+                    </m:r>
+                    <m:r>
+                      <m:rPr>
+                        <m:sty m:val="p"/>
+                      </m:rPr>
+                      <m:t>|</m:t>
+                    </m:r>
+                    <m:r>
+                      <m:t>A</m:t>
+                    </m:r>
+                    <m:r>
+                      <m:rPr>
+                        <m:sty m:val="p"/>
+                      </m:rPr>
+                      <m:t>,</m:t>
+                    </m:r>
+                    <m:r>
+                      <m:t>C</m:t>
+                    </m:r>
+                    <m:r>
+                      <m:rPr>
+                        <m:sty m:val="p"/>
+                      </m:rPr>
+                      <m:t>)</m:t>
+                    </m:r>
+                    <m:r>
+                      <m:t>&amp;</m:t>
+                    </m:r>
+                    <m:r>
+                      <m:t>&amp;</m:t>
+                    </m:r>
+                    <m:r>
+                      <m:rPr>
+                        <m:nor/>
+                        <m:sty m:val="p"/>
+                      </m:rPr>
+                      <m:t>(definition of odds ratio)</m:t>
+                    </m:r>
+                  </m:e>
+                </m:eqArr>
+              </m:oMath>
+            </m:oMathPara>
           </w:p>
           <w:p/>
         </w:tc>
@@ -36948,7 +40623,7 @@
           </w:tcPr>
           <w:p>
             <w:pPr>
-              <w:pStyle w:val="BodyText"/>
+              <w:pStyle w:val="FirstParagraph"/>
             </w:pPr>
             <w:pPr>
               <w:spacing w:before="16" w:after="16"/>

</xml_diff>

<commit_message>
Deploying to gh-pages from @ Morrison-Lab/rme@008f96bfad0b92af8780cc1912a5d59bfbed9e37 🚀
</commit_message>
<xml_diff>
--- a/chapters/binary-outcome-associations-handout.docx
+++ b/chapters/binary-outcome-associations-handout.docx
@@ -16955,6 +16955,9 @@
             <w:r>
               <w:t xml:space="preserve">.</w:t>
             </w:r>
+            <w:r>
+              <w:t xml:space="preserve"> </w:t>
+            </w:r>
           </w:p>
           <w:p/>
         </w:tc>
@@ -24042,6 +24045,9 @@
             <w:r>
               <w:t xml:space="preserve">.</w:t>
             </w:r>
+            <w:r>
+              <w:t xml:space="preserve"> </w:t>
+            </w:r>
           </w:p>
           <w:p/>
         </w:tc>
@@ -25267,6 +25273,9 @@
             </w:hyperlink>
             <w:r>
               <w:t xml:space="preserve">.</w:t>
+            </w:r>
+            <w:r>
+              <w:t xml:space="preserve"> </w:t>
             </w:r>
           </w:p>
           <w:p/>

</xml_diff>

<commit_message>
Deploying to gh-pages from @ Morrison-Lab/rme@92944c0b2eeb8832116922bc7c04f8d45985ea22 🚀
</commit_message>
<xml_diff>
--- a/chapters/binary-outcome-associations-handout.docx
+++ b/chapters/binary-outcome-associations-handout.docx
@@ -57561,6 +57561,30 @@
                   </w:r>
                   <w:r>
                     <w:rPr>
+                      <w:rStyle w:val="StringTok"/>
+                    </w:rPr>
+                    <w:t xml:space="preserve">"Probability, "</w:t>
+                  </w:r>
+                  <w:r>
+                    <w:rPr>
+                      <w:rStyle w:val="NormalTok"/>
+                    </w:rPr>
+                    <w:t xml:space="preserve"> </w:t>
+                  </w:r>
+                  <w:r>
+                    <w:rPr>
+                      <w:rStyle w:val="SpecialCharTok"/>
+                    </w:rPr>
+                    <w:t xml:space="preserve">*</w:t>
+                  </w:r>
+                  <w:r>
+                    <w:rPr>
+                      <w:rStyle w:val="NormalTok"/>
+                    </w:rPr>
+                    <w:t xml:space="preserve"> </w:t>
+                  </w:r>
+                  <w:r>
+                    <w:rPr>
                       <w:rStyle w:val="FunctionTok"/>
                     </w:rPr>
                     <w:t xml:space="preserve">expit</w:t>
@@ -57608,7 +57632,31 @@
                     <w:rPr>
                       <w:rStyle w:val="NormalTok"/>
                     </w:rPr>
-                    <w:t xml:space="preserve">(eta)) </w:t>
+                    <w:t xml:space="preserve">(</w:t>
+                  </w:r>
+                  <w:r>
+                    <w:rPr>
+                      <w:rStyle w:val="StringTok"/>
+                    </w:rPr>
+                    <w:t xml:space="preserve">"Log-odds, "</w:t>
+                  </w:r>
+                  <w:r>
+                    <w:rPr>
+                      <w:rStyle w:val="NormalTok"/>
+                    </w:rPr>
+                    <w:t xml:space="preserve"> </w:t>
+                  </w:r>
+                  <w:r>
+                    <w:rPr>
+                      <w:rStyle w:val="SpecialCharTok"/>
+                    </w:rPr>
+                    <w:t xml:space="preserve">*</w:t>
+                  </w:r>
+                  <w:r>
+                    <w:rPr>
+                      <w:rStyle w:val="NormalTok"/>
+                    </w:rPr>
+                    <w:t xml:space="preserve"> eta)) </w:t>
                   </w:r>
                   <w:r>
                     <w:rPr>

</xml_diff>